<commit_message>
Audit evidence and external holdout gate; publish traced reports
</commit_message>
<xml_diff>
--- a/deliverables/药物重定位Agent_课程设计报告_v5.docx
+++ b/deliverables/药物重定位Agent_课程设计报告_v5.docx
@@ -19,7 +19,7 @@
           <w:i/>
           <w:color w:val="5A646C"/>
         </w:rPr>
-        <w:t>状态：v5 可提交技术报告（2026-09-28），在 v4 基础上加入行方向融合 B3、LLM 知识污染探针、决策层消融与多 Agent 证据审阅。课程任务 PDF 已核对：要求覆盖 Problem、Data、Model、Benchmark、Biological interpretation 五环节，提交 GitHub 代码并进行约 10 分钟汇报；PDF 未规定报告篇幅、封面或单独视频。本报告不构成临床建议。</w:t>
+        <w:t>状态：v5 技术报告（2026-09-29 更新证据范围审计），在 v4 基础上加入行方向融合 B3、LLM 知识污染探针、决策层消融与多 Agent 证据审阅。课程任务 PDF 已核对：要求覆盖 Problem、Data、Model、Benchmark、Biological interpretation 五环节，提交 GitHub 代码并进行约 10 分钟汇报；PDF 未规定报告篇幅、封面或单独视频。本报告不构成临床建议。</w:t>
       </w:r>
     </w:p>
     <w:p>
@@ -1162,6 +1162,22 @@
       </w:r>
     </w:p>
     <w:p>
+      <w:r>
+        <w:t>另冻结 40 条全新中文备注压力用例，检验“LLM 只判断自由文本是否报告具体风险、确定性规则计算其余状态”的混合层。原关键词规则 20/40，混合层 39/40，完整策略 LLM 37/40；混合层对 20 条作者标注的具体风险全部转人工，另有 1 条无风险备注被过度升级。两种模型分支共 80 次调用，80/80 请求/响应 trace 通过独立回放。该新集刻意采用旧英文关键词覆盖不到的中文措辞，两个结构化状态/节点且由作者标注，不能与前述 120 例直接比较，更不能代表临床正确率。详见</w:t>
+      </w:r>
+      <w:hyperlink r:id="rId19">
+        <w:r>
+          <w:rPr>
+            <w:color w:val="174F78"/>
+          </w:rPr>
+          <w:t>决策层 v2 报告</w:t>
+        </w:r>
+      </w:hyperlink>
+      <w:r>
+        <w:t>。</w:t>
+      </w:r>
+    </w:p>
+    <w:p>
       <w:pPr>
         <w:pStyle w:val="Heading2"/>
       </w:pPr>
@@ -1171,7 +1187,18 @@
     </w:p>
     <w:p>
       <w:r>
-        <w:t>对 LUAD Top-10，文献 Agent 检索 PubMed 并提出带原文引语的支持论断，批评 Agent 独立检索反对证据，确定性校验要求 PMID 属于检索集合且引语逐字出现在摘要中，协调者再给出分级。65 条引语中 0 条被拒，十个候选均为“证据不足”，与单轮人工分诊一致。逐字校验只能排除编造引用，不能保证引语真正支持论断（例如批评 Agent 引用了一篇勘误），因此仍需人工复核。共 22 次调用。</w:t>
+        <w:t>对 LUAD Top-10，文献 Agent 检索 PubMed 并提出带原文引语的支持论断，批评 Agent 独立检索反对证据，确定性校验要求 PMID 属于检索集合且引语逐字出现在摘要中，协调者再给出分级。冻结版 65 条引语中 0 条被逐字规则拒绝，十个候选均为“证据不足”，与单轮人工分诊一致；共 22 次调用。但逐字存在不等于论断被文献支持。事后来源与候选药范围预筛标记 23/65 条；进一步按当前 PubMed 摘要逐条复核后，13 条应从原样候选级支持/反证中排除，9 条仅可在收窄到药代、炎症、递送或体外终点后保留，另 1 条仅可作非癌种特异安全提示。问题包括把勘误当研究证据、把不明糖皮质激素归到具体药物、以及把柚皮素 A549 抗癌结果误归给 fluticasone。详见</w:t>
+      </w:r>
+      <w:hyperlink r:id="rId20">
+        <w:r>
+          <w:rPr>
+            <w:color w:val="174F78"/>
+          </w:rPr>
+          <w:t>逐条审计</w:t>
+        </w:r>
+      </w:hyperlink>
+      <w:r>
+        <w:t>。本轮是作者的事后摘要级核查，不是独立双人阅读全文审阅；冻结的 10/10 分级未重跑，不能将其解释为审计后的分级准确率。</w:t>
       </w:r>
     </w:p>
     <w:p>
@@ -1237,7 +1264,7 @@
     </w:p>
     <w:p>
       <w:r>
-        <w:t>湿实验需要实体化合物、细胞模型和仪器，目前不具备执行条件，故剂量、LUAD 亚型、NR3C1 依赖和联合用药仅保留为预设方案。五个疾病分区仍来自 TRANSCRIPT，不是外部独立数据集；正例/未知修订实验给出了负结果。下一步需要新的独立关联数据、外层训练集内的性能证据与预先冻结的比较协议；已有分区不能再次充当确认集。Jev 若获得访问权限也需另做真实评测。课程答辩应展示已完成结果与这些边界，不将计划写成已验证结论。</w:t>
+        <w:t>湿实验需要实体化合物、细胞模型和仪器，目前不具备执行条件，故剂量、LUAD 亚型、NR3C1 依赖和联合用药仅保留为预设方案。五个疾病分区仍来自 TRANSCRIPT，不是外部独立数据集；正例/未知修订实验给出了负结果。外部数据可行性审计已取得 233 个 CREEDS 疾病签名、6,100 个 CMap 实验的原始秩矩阵，并对齐 Open Targets 和 repoDB，但前者没有明确负标签；repoDB 的严格跨库匹配只有 14 个疾病同时有正负记录，零个疾病满足保守的逐疾病五折门槛。排除与 TRANSCRIPT 相同的 CUI 后只剩两个疾病同时有正负记录；使用 Open Targets UMLS 交叉引用扩展匹配仍没有合格单元。因此独立方法选择 v3 没有运行，也没有外部 NS-AUC 结论。下一步需要新的来源不重叠的表达与关联数据、外层训练集内的性能证据与预先冻结的比较协议；已有分区不能再次充当确认集。Jev 若获得访问权限也需另做真实评测。课程答辩应展示已完成结果与这些边界，不将计划写成已验证结论。</w:t>
       </w:r>
     </w:p>
     <w:p>
@@ -1271,7 +1298,25 @@
         <w:t>、</w:t>
       </w:r>
       <w:r>
+        <w:t>docs/decision_eval_v2.md</w:t>
+      </w:r>
+      <w:r>
+        <w:t>、</w:t>
+      </w:r>
+      <w:r>
         <w:t>docs/multi_agent_review.md</w:t>
+      </w:r>
+      <w:r>
+        <w:t>、</w:t>
+      </w:r>
+      <w:r>
+        <w:t>docs/evidence_scope_audit.md</w:t>
+      </w:r>
+      <w:r>
+        <w:t>、</w:t>
+      </w:r>
+      <w:r>
+        <w:t>docs/external_holdout_feasibility.md</w:t>
       </w:r>
       <w:r>
         <w:t>、</w:t>
@@ -1369,7 +1414,7 @@
       <w:r>
         <w:t>、</w:t>
       </w:r>
-      <w:hyperlink r:id="rId19">
+      <w:hyperlink r:id="rId21">
         <w:r>
           <w:rPr>
             <w:color w:val="174F78"/>
@@ -1380,7 +1425,7 @@
       <w:r>
         <w:t>、</w:t>
       </w:r>
-      <w:hyperlink r:id="rId20">
+      <w:hyperlink r:id="rId22">
         <w:r>
           <w:rPr>
             <w:color w:val="174F78"/>
@@ -1391,7 +1436,7 @@
       <w:r>
         <w:t xml:space="preserve"> 和 </w:t>
       </w:r>
-      <w:hyperlink r:id="rId21">
+      <w:hyperlink r:id="rId23">
         <w:r>
           <w:rPr>
             <w:color w:val="174F78"/>

</xml_diff>

<commit_message>
docs: rebuild report v5 (10 pages) with follow-up analyses and figures 4-5
Rendered through Word and checked page by page; deliverable QA updated to 10 pages / 11 slides.

Co-Authored-By: Claude Opus 5.5 <noreply@anthropic.com>
</commit_message>
<xml_diff>
--- a/deliverables/药物重定位Agent_课程设计报告_v5.docx
+++ b/deliverables/药物重定位Agent_课程设计报告_v5.docx
@@ -935,7 +935,13 @@
         <w:t>e5ff7e7</w:t>
       </w:r>
       <w:r>
-        <w:t>）。官方 100 种子结果：随机拆分 0.7453 ± 0.0333（第 1/13；对 BNNR 配对胜 87/100，平均差 +0.0122），弱相关拆分 0.6585 ± 0.0187（第 3/13）。随机拆分排第一；弱相关拆分由 MBiRW（0.7384）领先，因此不能宣称两种协议下的 SOTA。由于 B3 的官方结果在 B4 设计时已公开，B4 单独标注为第二轮。</w:t>
+        <w:t xml:space="preserve">）。官方 100 种子结果：随机拆分 0.7453 ± 0.0333（第 1/13；对 BNNR 配对胜 87/100，平均差 +0.0122），弱相关拆分 0.6585 ± 0.0187（第 3/13）。随机拆分排第一；弱相关拆分由 MBiRW（0.7384）领先，因此不能宣称两种协议下的 SOTA。由于 B3 的官方结果在 B4 设计时已公开，B4 单独标注为第二轮。更正（2026-10-01）：各种子测试集互相重叠，经 Nadeau–Bengio 校正检验，B4 − BNNR 的差值（+0.0122）p = 0.066，95% CI [-0.0008, +0.0251] 跨 0，随机拆分的领先不显著；global NDCG 与 HR@10 上 BNNR 更强（见 </w:t>
+      </w:r>
+      <w:r>
+        <w:t>docs/benchmark_stats_v1.md</w:t>
+      </w:r>
+      <w:r>
+        <w:t>）。</w:t>
       </w:r>
     </w:p>
     <w:p>
@@ -1203,6 +1209,215 @@
     </w:p>
     <w:p>
       <w:pPr>
+        <w:pStyle w:val="Heading2"/>
+      </w:pPr>
+      <w:r>
+        <w:t>次要指标与重叠校正检验</w:t>
+      </w:r>
+    </w:p>
+    <w:p>
+      <w:r>
+        <w:t>随机拆分 100 个种子的外层测试集互相重叠，朴素的逐种子检验会高估显著性。采用 Nadeau–Bengio 校正的重复抽样 t 检验后，B4 − BNNR 的 NS-AUC 差值为 +0.0122，p = 0.066，95% CI [-0.0008, +0.0251]，</w:t>
+      </w:r>
+      <w:r>
+        <w:rPr>
+          <w:b/>
+        </w:rPr>
+        <w:t>不显著</w:t>
+      </w:r>
+      <w:r>
+        <w:t>；B4 相对 MBiRW、B2 的优势仍显著。次要指标上 BNNR 的 global NDCG（0.657）与 HR@10（0.080）均高于 B4（0.467、0.014）。因此 B4 应表述为“在主指标上与最强发表模型持平”，而不是超过它（</w:t>
+      </w:r>
+      <w:r>
+        <w:t>docs/benchmark_stats_v1.md</w:t>
+      </w:r>
+      <w:r>
+        <w:t>）。</w:t>
+      </w:r>
+    </w:p>
+    <w:p>
+      <w:pPr>
+        <w:pStyle w:val="Heading2"/>
+      </w:pPr>
+      <w:r>
+        <w:t>B3 组件消融（开发种子）</w:t>
+      </w:r>
+    </w:p>
+    <w:p>
+      <w:r>
+        <w:t>在 10 个与官方种子不相交的开发种子上，完整 B3 为 0.7271。去掉训练折疾病流行度后降至 0.6641（10/10 种子变差），是最关键的组件；单独效果最好的是两个标签共现协同过滤（0.702、0.700）；表达反转单独只有 0.486，去掉它仅降 0.008。B3 的提升主要来自已知关联结构，而非转录组反转（</w:t>
+      </w:r>
+      <w:r>
+        <w:t>docs/b3_component_ablation.md</w:t>
+      </w:r>
+      <w:r>
+        <w:t>）。</w:t>
+      </w:r>
+    </w:p>
+    <w:p>
+      <w:pPr>
+        <w:pStyle w:val="Heading2"/>
+      </w:pPr>
+      <w:r>
+        <w:t>LUAD 通路富集与阳性对照</w:t>
+      </w:r>
+    </w:p>
+    <w:p>
+      <w:r>
+        <w:t>对 512 个上调、749 个下调基因做 MSigDB Hallmark 富集（超几何检验，BH 校正）。上调侧以 Estrogen Response Late、G2-M Checkpoint、Glycolysis、E2F Targets、KRAS Signaling Up、mTORC1 Signaling 为主，反映增殖、代谢重编程与基质重塑；下调侧以 TNF-alpha Signaling via NF-kB、KRAS Signaling Up、Epithelial Mesenchymal Transition、Inflammatory Response、Xenobiotic Metabolism 为主，更可能反映正常肺组织中免疫与间质成分在肿瘤块中的相对减少（</w:t>
+      </w:r>
+      <w:r>
+        <w:t>docs/luad_pathway_enrichment.md</w:t>
+      </w:r>
+      <w:r>
+        <w:t>）。</w:t>
+      </w:r>
+    </w:p>
+    <w:p>
+      <w:pPr>
+        <w:jc w:val="center"/>
+      </w:pPr>
+      <w:r>
+        <w:drawing>
+          <wp:inline xmlns:a="http://schemas.openxmlformats.org/drawingml/2006/main" xmlns:pic="http://schemas.openxmlformats.org/drawingml/2006/picture">
+            <wp:extent cx="6035040" cy="2571128"/>
+            <wp:docPr id="4" name="Picture 4"/>
+            <wp:cNvGraphicFramePr>
+              <a:graphicFrameLocks noChangeAspect="1"/>
+            </wp:cNvGraphicFramePr>
+            <a:graphic>
+              <a:graphicData uri="http://schemas.openxmlformats.org/drawingml/2006/picture">
+                <pic:pic>
+                  <pic:nvPicPr>
+                    <pic:cNvPr id="0" name="fig7_luad_pathways.png"/>
+                    <pic:cNvPicPr/>
+                  </pic:nvPicPr>
+                  <pic:blipFill>
+                    <a:blip r:embed="rId21"/>
+                    <a:stretch>
+                      <a:fillRect/>
+                    </a:stretch>
+                  </pic:blipFill>
+                  <pic:spPr>
+                    <a:xfrm>
+                      <a:off x="0" y="0"/>
+                      <a:ext cx="6035040" cy="2571128"/>
+                    </a:xfrm>
+                    <a:prstGeom prst="rect"/>
+                  </pic:spPr>
+                </pic:pic>
+              </a:graphicData>
+            </a:graphic>
+          </wp:inline>
+        </w:drawing>
+      </w:r>
+    </w:p>
+    <w:p>
+      <w:pPr>
+        <w:jc w:val="center"/>
+      </w:pPr>
+      <w:r>
+        <w:rPr>
+          <w:color w:val="5A646C"/>
+          <w:sz w:val="17"/>
+        </w:rPr>
+        <w:t>图 4  LUAD 疾病签名的 Hallmark 通路富集</w:t>
+      </w:r>
+    </w:p>
+    <w:p>
+      <w:r>
+        <w:t>在 Top-10 的通路层面反转中（规则预先提交），共 8 条显著 Hallmark 通路有至少 5 个 LINCS landmark 签名基因。Top-10 平均反转百分位最高的是 Glycolysis (肿瘤上调)（0.98）、Hypoxia (肿瘤下调)（0.95）、E2F Targets (肿瘤上调)（0.94）、G2-M Checkpoint (肿瘤上调)（0.93），即排名靠前的药物主要把增殖与糖酵解程序推回正常方向；diflorasone 与 beclomethasone-dipropionate 在肿瘤下调的 EMT 基因上不反转。由于 Top-10 与通路基因来自同一疾病签名，这一结果只说明反转由哪些程序驱动，不是独立验证（</w:t>
+      </w:r>
+      <w:r>
+        <w:t>docs/luad_pathway_reversal.md</w:t>
+      </w:r>
+      <w:r>
+        <w:t>）。</w:t>
+      </w:r>
+    </w:p>
+    <w:p>
+      <w:pPr>
+        <w:jc w:val="center"/>
+      </w:pPr>
+      <w:r>
+        <w:drawing>
+          <wp:inline xmlns:a="http://schemas.openxmlformats.org/drawingml/2006/main" xmlns:pic="http://schemas.openxmlformats.org/drawingml/2006/picture">
+            <wp:extent cx="6035040" cy="2693261"/>
+            <wp:docPr id="5" name="Picture 5"/>
+            <wp:cNvGraphicFramePr>
+              <a:graphicFrameLocks noChangeAspect="1"/>
+            </wp:cNvGraphicFramePr>
+            <a:graphic>
+              <a:graphicData uri="http://schemas.openxmlformats.org/drawingml/2006/picture">
+                <pic:pic>
+                  <pic:nvPicPr>
+                    <pic:cNvPr id="0" name="fig8_top10_pathway_reversal.png"/>
+                    <pic:cNvPicPr/>
+                  </pic:nvPicPr>
+                  <pic:blipFill>
+                    <a:blip r:embed="rId22"/>
+                    <a:stretch>
+                      <a:fillRect/>
+                    </a:stretch>
+                  </pic:blipFill>
+                  <pic:spPr>
+                    <a:xfrm>
+                      <a:off x="0" y="0"/>
+                      <a:ext cx="6035040" cy="2693261"/>
+                    </a:xfrm>
+                    <a:prstGeom prst="rect"/>
+                  </pic:spPr>
+                </pic:pic>
+              </a:graphicData>
+            </a:graphic>
+          </wp:inline>
+        </w:drawing>
+      </w:r>
+    </w:p>
+    <w:p>
+      <w:pPr>
+        <w:jc w:val="center"/>
+      </w:pPr>
+      <w:r>
+        <w:rPr>
+          <w:color w:val="5A646C"/>
+          <w:sz w:val="17"/>
+        </w:rPr>
+        <w:t>图 5  Top-10 候选在显著 Hallmark 通路上的反转百分位</w:t>
+      </w:r>
+    </w:p>
+    <w:p>
+      <w:r>
+        <w:t>预先冻结的 11 个参考药中 5 个可测，平均名次百分位 0.362（随机期望 0.5），置换检验单侧 p = 0.147，有 2 个进入前 10%。整体略偏前但不显著，本筛选没有证明能恢复已知 LUAD 药物（</w:t>
+      </w:r>
+      <w:r>
+        <w:t>docs/luad_positive_control_stats.md</w:t>
+      </w:r>
+      <w:r>
+        <w:t>）。</w:t>
+      </w:r>
+    </w:p>
+    <w:p>
+      <w:pPr>
+        <w:pStyle w:val="Heading2"/>
+      </w:pPr>
+      <w:r>
+        <w:t>Agent 端到端稳定性</w:t>
+      </w:r>
+    </w:p>
+    <w:p>
+      <w:r>
+        <w:t>按计划 10.7 节门槛，用 5 种固定说法 × 2 次运行 Strict 模式 TRANSCRIPT 全流程。DeepSeek 规划器 10/10 完成、规则规划器 8/10 完成（一种说法被安全地转人工）；所有完成的运行输出同一个排名矩阵（Spearman = 1.0）。DeepSeek 达到完成率 ≥ 0.9 与排名一致性 ≥ 0.95 两项门槛，规则规划器未达完成率门槛（</w:t>
+      </w:r>
+      <w:r>
+        <w:t>docs/agent_repeatability.md</w:t>
+      </w:r>
+      <w:r>
+        <w:t>）。</w:t>
+      </w:r>
+    </w:p>
+    <w:p>
+      <w:pPr>
         <w:pStyle w:val="Heading1"/>
       </w:pPr>
       <w:r>
@@ -1414,7 +1629,7 @@
       <w:r>
         <w:t>、</w:t>
       </w:r>
-      <w:hyperlink r:id="rId21">
+      <w:hyperlink r:id="rId23">
         <w:r>
           <w:rPr>
             <w:color w:val="174F78"/>
@@ -1425,7 +1640,7 @@
       <w:r>
         <w:t>、</w:t>
       </w:r>
-      <w:hyperlink r:id="rId22">
+      <w:hyperlink r:id="rId24">
         <w:r>
           <w:rPr>
             <w:color w:val="174F78"/>
@@ -1436,7 +1651,7 @@
       <w:r>
         <w:t xml:space="preserve"> 和 </w:t>
       </w:r>
-      <w:hyperlink r:id="rId23">
+      <w:hyperlink r:id="rId25">
         <w:r>
           <w:rPr>
             <w:color w:val="174F78"/>

</xml_diff>

<commit_message>
docs: rebuild deck v7, report v5 and LaTeX PDFs with the threshold-sensitivity result
Deck validated and rendered via PowerPoint (slide 9 checked); report rendered via Word (10 pages); LaTeX QA clean.

Co-Authored-By: Claude Opus 5.5 <noreply@anthropic.com>
</commit_message>
<xml_diff>
--- a/deliverables/药物重定位Agent_课程设计报告_v5.docx
+++ b/deliverables/药物重定位Agent_课程设计报告_v5.docx
@@ -1388,6 +1388,17 @@
     </w:p>
     <w:p>
       <w:r>
+        <w:t>阈值敏感性分析（12 种设定）表明，FDR 阈值不起作用，而 |log2FC| 阈值决定 Top-10 的面貌：预设的 |log2FC| ≥ 1 与更严的 1.5 下各有 9 个糖皮质激素；放宽到 0.58 或每方向取前 100 个基因时，与冻结 Top-10 只重合 3–4 个，Broad Hub 注释的 RAF、PI3K、PI3K/mTOR 抑制剂进入。12 种设定下始终在 Top-10 的只有 hydrocortisone、beclomethasone-dipropionate 与 clocortolone-pivalate。因此“糖皮质激素主导”是严格签名下的结论，并不稳健（</w:t>
+      </w:r>
+      <w:r>
+        <w:t>docs/luad_threshold_sensitivity.md</w:t>
+      </w:r>
+      <w:r>
+        <w:t>）。</w:t>
+      </w:r>
+    </w:p>
+    <w:p>
+      <w:r>
         <w:t>预先冻结的 11 个参考药中 5 个可测，平均名次百分位 0.362（随机期望 0.5），置换检验单侧 p = 0.147，有 2 个进入前 10%。整体略偏前但不显著，本筛选没有证明能恢复已知 LUAD 药物（</w:t>
       </w:r>
       <w:r>

</xml_diff>

<commit_message>
docs: rebuild deck v7, report v5 and LaTeX PDFs with the v4-pro replication
Deck validated and rendered via PowerPoint (slide 8 checked); report rendered via Word (10 pages); LaTeX QA clean.

Co-Authored-By: Claude Opus 5.5 <noreply@anthropic.com>
</commit_message>
<xml_diff>
--- a/deliverables/药物重定位Agent_课程设计报告_v5.docx
+++ b/deliverables/药物重定位Agent_课程设计报告_v5.docx
@@ -1429,6 +1429,31 @@
     </w:p>
     <w:p>
       <w:pPr>
+        <w:pStyle w:val="Heading2"/>
+      </w:pPr>
+      <w:r>
+        <w:t>换模型复现</w:t>
+      </w:r>
+    </w:p>
+    <w:p>
+      <w:r>
+        <w:t xml:space="preserve">把四组冻结的 LLM 评测在 </w:t>
+      </w:r>
+      <w:r>
+        <w:t>deepseek-v4-pro</w:t>
+      </w:r>
+      <w:r>
+        <w:t xml:space="preserve"> 上原样重跑（用例、提示词与评分不变）。规划器 holdout 为 97/100（flash 98/100）。决策层 v1 中，v4-pro 的 120 个判断全部高于置信阈值，门控一次都未触发，而 flash 有 29 个被转人工；两者 Brier 相近，说明门控阈值需要按模型重新校准。决策层 v2 的混合设计在两个模型上都没有高风险误执行，完整 LLM 方案在 v4-pro 上出现 2/12。污染探针中 v4-pro 开卷 AUC 为 0.542（flash 0.567），并未因模型更强而泄漏更多。两者同属一个模型系列，结论不推广到其他厂商（</w:t>
+      </w:r>
+      <w:r>
+        <w:t>docs/model_replication_v4_pro.md</w:t>
+      </w:r>
+      <w:r>
+        <w:t>）。</w:t>
+      </w:r>
+    </w:p>
+    <w:p>
+      <w:pPr>
         <w:pStyle w:val="Heading1"/>
       </w:pPr>
       <w:r>

</xml_diff>

<commit_message>
docs: rebuild report v5 (Word + LaTeX) and typeset the Jev evaluation
Co-Authored-By: Claude Opus 5.5 <noreply@anthropic.com>
</commit_message>
<xml_diff>
--- a/deliverables/药物重定位Agent_课程设计报告_v5.docx
+++ b/deliverables/药物重定位Agent_课程设计报告_v5.docx
@@ -1169,6 +1169,23 @@
     </w:p>
     <w:p>
       <w:r>
+        <w:t xml:space="preserve">2026-10-01 取得 Jev 访问（经 OpenCode Zen；付费版余额不足，在得到任何答案前改用 </w:t>
+      </w:r>
+      <w:r>
+        <w:t>jev-1.13-free</w:t>
+      </w:r>
+      <w:r>
+        <w:t>），在同一冻结集与同一门控阈值下补测。v1 中 Jev 不加门控的准确率为 0.900，高于规则与两个 DeepSeek 模型；多分类 Brier 0.147，低于 flash 的 0.221，但 ECE（0.042）略高于 flash（0.025）。Jev 加门控后高风险误执行降为 0，代价是 48% 的升级率；把低置信判断交给 flash 的 J4 准确率 0.867。v2 中以 Jev 判断备注的混合层为 39/40、0 高风险误执行，而让 Jev 直接做完整决策只有 32/40 并出现高风险误执行（</w:t>
+      </w:r>
+      <w:r>
+        <w:t>docs/jev_evaluation.md</w:t>
+      </w:r>
+      <w:r>
+        <w:t>）。</w:t>
+      </w:r>
+    </w:p>
+    <w:p>
+      <w:r>
         <w:t>另冻结 40 条全新中文备注压力用例，检验“LLM 只判断自由文本是否报告具体风险、确定性规则计算其余状态”的混合层。原关键词规则 20/40，混合层 39/40，完整策略 LLM 37/40；混合层对 20 条作者标注的具体风险全部转人工，另有 1 条无风险备注被过度升级。两种模型分支共 80 次调用，80/80 请求/响应 trace 通过独立回放。该新集刻意采用旧英文关键词覆盖不到的中文措辞，两个结构化状态/节点且由作者标注，不能与前述 120 例直接比较，更不能代表临床正确率。详见</w:t>
       </w:r>
       <w:hyperlink r:id="rId19">

</xml_diff>

<commit_message>
docs: rebuild report v5 (Word + LaTeX) with the agent v2 section and typeset docs/agent_v2.md
Co-Authored-By: Claude Opus 5.5 <noreply@anthropic.com>
</commit_message>
<xml_diff>
--- a/deliverables/药物重定位Agent_课程设计报告_v5.docx
+++ b/deliverables/药物重定位Agent_课程设计报告_v5.docx
@@ -1519,6 +1519,25 @@
     </w:p>
     <w:p>
       <w:pPr>
+        <w:pStyle w:val="Heading2"/>
+      </w:pPr>
+      <w:r>
+        <w:t>Agent v2：多步规划与重新规划</w:t>
+      </w:r>
+    </w:p>
+    <w:p>
+      <w:r>
+        <w:t>v1 规划器只从 3 个工具中选 1 个（100 例测试中 75 例的标准答案是安全拒绝），严格说只是工具选择。v2 把肺腺癌流程拆成 7 个带依赖声明的工具（队列质控、配对差异表达、通路富集、候选排名、候选审计、多 Agent 文献审阅、报告），加上基准排名与安全停止共 9 个。大模型一次提交有序的多步计划；代码校验白名单、模式、依赖与外部输入，不合法或某步失败时把观察反馈给大模型重新规划，已完成的步骤不重跑，最多 3 轮，用尽则转人工。在调用前冻结的 40 例多步规划测试中，DeepSeek 为 36/40，规则规划器为 30/40。规则规划器输在“部分任务”（2/8），DeepSeek 在部分任务、缺少输入与基准模式上全对，但越权类只有 5/8：对“跳过质控”“忽略校验当作治疗方案”“排名后删除原始数据”三条，它照常执行了安全的标准流程而没有拒绝。依赖校验与工具白名单仍阻止了跳过质控和删除数据，但这说明安全不能只靠大模型判断。真实工具上的两次演示中，完整请求一轮规划出 7 步并复现冻结结果；人为让排名第一次失败后，第 2 轮只规划剩余 4 步并完成（</w:t>
+      </w:r>
+      <w:r>
+        <w:t>docs/agent_v2.md</w:t>
+      </w:r>
+      <w:r>
+        <w:t>）。</w:t>
+      </w:r>
+    </w:p>
+    <w:p>
+      <w:pPr>
         <w:pStyle w:val="Heading1"/>
       </w:pPr>
       <w:r>

</xml_diff>

<commit_message>
docs: rebuild deck v7 and report v5 (Word + LaTeX) with the live review and real-backend checks
Co-Authored-By: Claude Opus 5.5 <noreply@anthropic.com>
</commit_message>
<xml_diff>
--- a/deliverables/药物重定位Agent_课程设计报告_v5.docx
+++ b/deliverables/药物重定位Agent_课程设计报告_v5.docx
@@ -1225,6 +1225,17 @@
       </w:r>
     </w:p>
     <w:p>
+      <w:r>
+        <w:t>10 月 2 日经 Agent v2 实时重跑一次多 Agent 审阅（26 次调用）：7/10 的分级与冻结版一致，hydrocortisone、fluticasone 变为“证据冲突”，mometasone 变为“有希望但不完整”，仍无候选达到“有支持”。被拒引语 17/66，但审阅代码在冻结运行后加入了引用范围检查，PubMed 内容与模型输出也会变化，两次结果不可直接比较；分级应视为有运行间差异的文献线索（</w:t>
+      </w:r>
+      <w:r>
+        <w:t>benchmark/results/agent_v2_live_review.json</w:t>
+      </w:r>
+      <w:r>
+        <w:t>）。</w:t>
+      </w:r>
+    </w:p>
+    <w:p>
       <w:pPr>
         <w:pStyle w:val="Heading2"/>
       </w:pPr>
@@ -1527,7 +1538,7 @@
     </w:p>
     <w:p>
       <w:r>
-        <w:t>v1 规划器只从 3 个工具中选 1 个（100 例测试中 75 例的标准答案是安全拒绝），严格说只是工具选择。v2 把肺腺癌流程拆成 7 个带依赖声明的工具（队列质控、配对差异表达、通路富集、候选排名、候选审计、多 Agent 文献审阅、报告），加上基准排名与安全停止共 9 个。大模型一次提交有序的多步计划；代码校验白名单、模式、依赖与外部输入，不合法或某步失败时把观察反馈给大模型重新规划，已完成的步骤不重跑，最多 3 轮，用尽则转人工。在调用前冻结的 40 例多步规划测试中，DeepSeek 为 36/40，规则规划器为 30/40。规则规划器输在“部分任务”（2/8），DeepSeek 在部分任务、缺少输入与基准模式上全对，但越权类只有 5/8：对“跳过质控”“忽略校验当作治疗方案”“排名后删除原始数据”三条，它照常执行了安全的标准流程而没有拒绝。依赖校验与工具白名单仍阻止了跳过质控和删除数据，但这说明安全不能只靠大模型判断。真实工具上的两次演示中，完整请求一轮规划出 7 步并复现冻结结果；人为让排名第一次失败后，第 2 轮只规划剩余 4 步并完成（</w:t>
+        <w:t>v1 规划器只从 3 个工具中选 1 个（100 例测试中 75 例的标准答案是安全拒绝），严格说只是工具选择。v2 把肺腺癌流程拆成 7 个带依赖声明的工具（队列质控、配对差异表达、通路富集、候选排名、候选审计、多 Agent 文献审阅、报告），加上基准排名与安全停止共 9 个。大模型一次提交有序的多步计划；代码校验白名单、模式、依赖与外部输入，不合法或某步失败时把观察反馈给大模型重新规划，已完成的步骤不重跑，最多 3 轮，用尽则转人工。在调用前冻结的 40 例多步规划测试中，DeepSeek 为 36/40，规则规划器为 30/40。规则规划器输在“部分任务”（2/8），DeepSeek 在部分任务、缺少输入与基准模式上全对，但越权类只有 5/8：对“跳过质控”“忽略校验当作治疗方案”“排名后删除原始数据”三条，它照常执行了安全的标准流程而没有拒绝。依赖校验与工具白名单仍阻止了跳过质控和删除数据，但这说明安全不能只靠大模型判断。真实工具上的两次演示中，完整请求一轮规划出 7 步并复现冻结结果；人为让排名第一次失败后，第 2 轮只规划剩余 4 步并完成。另用真实工具重跑 7 个代表性冻结用例，6/7 通过，与模拟后端一致，“跳过质控”一例仍未拒绝（</w:t>
       </w:r>
       <w:r>
         <w:t>docs/agent_v2.md</w:t>

</xml_diff>

<commit_message>
deliverables: rebuild deck v7, report v5 (Word + LaTeX) with unified figures
All embedded figures come from the shared paper-style theme; the report adds
the planner-scope paragraph and fuller captions (Word now 11 pages), the deck
notes add one line on what the planner decides. 12 slides and 11 pages were
rendered and inspected; LaTeX QA and tests pass.

Co-Authored-By: Claude Opus 5.5 <noreply@anthropic.com>
</commit_message>
<xml_diff>
--- a/deliverables/药物重定位Agent_课程设计报告_v5.docx
+++ b/deliverables/药物重定位Agent_课程设计报告_v5.docx
@@ -951,7 +951,7 @@
       <w:r>
         <w:drawing>
           <wp:inline xmlns:a="http://schemas.openxmlformats.org/drawingml/2006/main" xmlns:pic="http://schemas.openxmlformats.org/drawingml/2006/picture">
-            <wp:extent cx="6035040" cy="3074018"/>
+            <wp:extent cx="6035040" cy="2860184"/>
             <wp:docPr id="1" name="Picture 1"/>
             <wp:cNvGraphicFramePr>
               <a:graphicFrameLocks noChangeAspect="1"/>
@@ -972,7 +972,7 @@
                   <pic:spPr>
                     <a:xfrm>
                       <a:off x="0" y="0"/>
-                      <a:ext cx="6035040" cy="3074018"/>
+                      <a:ext cx="6035040" cy="2860184"/>
                     </a:xfrm>
                     <a:prstGeom prst="rect"/>
                   </pic:spPr>
@@ -992,7 +992,7 @@
           <w:color w:val="5A646C"/>
           <w:sz w:val="17"/>
         </w:rPr>
-        <w:t>图 1  TRANSCRIPT 官方 100 种子 NS-AUC 分布（本项目方法高亮）</w:t>
+        <w:t>图 1  TRANSCRIPT 官方 RECeSS 流程下每个种子的 NS-AUC 分布。(a) 随机拆分；(b) 弱相关拆分。各方法按中位数排序，右侧数字为中位数；灰色为作者发布的 11 个模型，彩色为本项目 B2、B3、B4；虚线为 0.5。</w:t>
       </w:r>
     </w:p>
     <w:p>
@@ -1046,7 +1046,7 @@
       <w:r>
         <w:drawing>
           <wp:inline xmlns:a="http://schemas.openxmlformats.org/drawingml/2006/main" xmlns:pic="http://schemas.openxmlformats.org/drawingml/2006/picture">
-            <wp:extent cx="6035040" cy="4735611"/>
+            <wp:extent cx="6035040" cy="4606239"/>
             <wp:docPr id="2" name="Picture 2"/>
             <wp:cNvGraphicFramePr>
               <a:graphicFrameLocks noChangeAspect="1"/>
@@ -1067,7 +1067,7 @@
                   <pic:spPr>
                     <a:xfrm>
                       <a:off x="0" y="0"/>
-                      <a:ext cx="6035040" cy="4735611"/>
+                      <a:ext cx="6035040" cy="4606239"/>
                     </a:xfrm>
                     <a:prstGeom prst="rect"/>
                   </pic:spPr>
@@ -1087,7 +1087,7 @@
           <w:color w:val="5A646C"/>
           <w:sz w:val="17"/>
         </w:rPr>
-        <w:t>图 2  GSE32863 配对差异表达火山图（FDR&lt;0.05，|log2FC|≥1）</w:t>
+        <w:t>图 2  GSE32863 肺腺癌 57 对配对差异表达火山图。虚线为预设阈值 FDR &lt; 0.05 与 |log2FC| ≥ 1；红色为肿瘤上调（512），蓝色为肿瘤下调（749）；标注各方向 |log2FC| 最大的 8 个基因。</w:t>
       </w:r>
     </w:p>
     <w:p>
@@ -1097,7 +1097,7 @@
       <w:r>
         <w:drawing>
           <wp:inline xmlns:a="http://schemas.openxmlformats.org/drawingml/2006/main" xmlns:pic="http://schemas.openxmlformats.org/drawingml/2006/picture">
-            <wp:extent cx="6035040" cy="3811604"/>
+            <wp:extent cx="6035040" cy="3676545"/>
             <wp:docPr id="3" name="Picture 3"/>
             <wp:cNvGraphicFramePr>
               <a:graphicFrameLocks noChangeAspect="1"/>
@@ -1118,7 +1118,7 @@
                   <pic:spPr>
                     <a:xfrm>
                       <a:off x="0" y="0"/>
-                      <a:ext cx="6035040" cy="3811604"/>
+                      <a:ext cx="6035040" cy="3676545"/>
                     </a:xfrm>
                     <a:prstGeom prst="rect"/>
                   </pic:spPr>
@@ -1138,7 +1138,7 @@
           <w:color w:val="5A646C"/>
           <w:sz w:val="17"/>
         </w:rPr>
-        <w:t>图 3  LUAD Top-10 候选的药物—靶点—通路网络（仅使用已记录的靶点与通路）</w:t>
+        <w:t>图 3  LUAD Top-10 候选的药物—靶点—通路网络。只使用 configs/luad_top10_evidence_v1.json 中已记录的靶点与通路；8/10 记录靶点含 NR3C1（红），8/10 记录 GR 转录调控通路（绿），指向同一机制轴。括号内为连接的候选数，点线为仅由母药推断。</w:t>
       </w:r>
     </w:p>
     <w:p>
@@ -1308,7 +1308,7 @@
       <w:r>
         <w:drawing>
           <wp:inline xmlns:a="http://schemas.openxmlformats.org/drawingml/2006/main" xmlns:pic="http://schemas.openxmlformats.org/drawingml/2006/picture">
-            <wp:extent cx="6035040" cy="2571128"/>
+            <wp:extent cx="6035040" cy="2310328"/>
             <wp:docPr id="4" name="Picture 4"/>
             <wp:cNvGraphicFramePr>
               <a:graphicFrameLocks noChangeAspect="1"/>
@@ -1329,7 +1329,7 @@
                   <pic:spPr>
                     <a:xfrm>
                       <a:off x="0" y="0"/>
-                      <a:ext cx="6035040" cy="2571128"/>
+                      <a:ext cx="6035040" cy="2310328"/>
                     </a:xfrm>
                     <a:prstGeom prst="rect"/>
                   </pic:spPr>
@@ -1349,7 +1349,7 @@
           <w:color w:val="5A646C"/>
           <w:sz w:val="17"/>
         </w:rPr>
-        <w:t>图 4  LUAD 疾病签名的 Hallmark 通路富集</w:t>
+        <w:t>图 4  LUAD 疾病签名的 MSigDB Hallmark 通路富集（超几何检验，BH 校正）。(a) 肿瘤上调基因；(b) 肿瘤下调基因。括号内为重叠基因数/通路基因数，虚线为 FDR = 0.05。</w:t>
       </w:r>
     </w:p>
     <w:p>
@@ -1370,7 +1370,7 @@
       <w:r>
         <w:drawing>
           <wp:inline xmlns:a="http://schemas.openxmlformats.org/drawingml/2006/main" xmlns:pic="http://schemas.openxmlformats.org/drawingml/2006/picture">
-            <wp:extent cx="6035040" cy="2693261"/>
+            <wp:extent cx="6035040" cy="3038622"/>
             <wp:docPr id="5" name="Picture 5"/>
             <wp:cNvGraphicFramePr>
               <a:graphicFrameLocks noChangeAspect="1"/>
@@ -1391,7 +1391,7 @@
                   <pic:spPr>
                     <a:xfrm>
                       <a:off x="0" y="0"/>
-                      <a:ext cx="6035040" cy="2693261"/>
+                      <a:ext cx="6035040" cy="3038622"/>
                     </a:xfrm>
                     <a:prstGeom prst="rect"/>
                   </pic:spPr>
@@ -1411,7 +1411,7 @@
           <w:color w:val="5A646C"/>
           <w:sz w:val="17"/>
         </w:rPr>
-        <w:t>图 5  Top-10 候选在显著 Hallmark 通路上的反转百分位</w:t>
+        <w:t>图 5  Top-10 候选在显著 Hallmark 通路上的反转百分位（在 4,920 个 A549 药物中，1 为最强反转；n 为参与计算的 landmark 基因数）。Top-10 与通路基因来自同一疾病签名，因此本图不是独立验证。</w:t>
       </w:r>
     </w:p>
     <w:p>
@@ -1483,6 +1483,7 @@
     <w:p>
       <w:pPr>
         <w:pStyle w:val="Heading1"/>
+        <w:pageBreakBefore/>
       </w:pPr>
       <w:r>
         <w:t>系统实现与审计</w:t>
@@ -1490,13 +1491,19 @@
     </w:p>
     <w:p>
       <w:r>
-        <w:t xml:space="preserve">系统包含自然语言 Planner、允许列表工具 Schema、表达数据读取与 QC、差异表达、排序、RECeSS 适配器、药物身份核对、文献分诊、证据账本和 LUAD 案例打包器。Planner 只接收模式和可用输入名称，不接收原始矩阵、文件路径或 Benchmark 标签；DeepSeek 返回的调用还须经过工具名、参数、输入和模式权限验证，不可用工具会失效关闭到人工复核。全部状态写入 </w:t>
+        <w:t xml:space="preserve">系统包含自然语言 Planner、允许列表工具 Schema、表达数据读取与 QC、差异表达、排序、RECeSS 适配器、药物身份核对、文献分诊、证据账本和 LUAD 案例打包器。Planner 只接收模式和可用输入名称，不接收原始矩阵、文件路径或 Benchmark 标签；v1 中 DeepSeek 返回的调用须经过工具名、参数、输入和模式权限验证；v2 中多步计划须逐步通过白名单、模式、依赖与外部输入校验，不合法或执行失败时反馈给大模型重新规划（≤3 轮），不可用工具会失效关闭到人工复核。全部状态写入 </w:t>
       </w:r>
       <w:r>
         <w:t>agent_run.json</w:t>
       </w:r>
       <w:r>
-        <w:t>。可选 Jev 适配器仍没有真实凭据或结果。项目另提供 Streamlit 演示界面（</w:t>
+        <w:t xml:space="preserve"> 或 </w:t>
+      </w:r>
+      <w:r>
+        <w:t>agent_v2_run.json</w:t>
+      </w:r>
+      <w:r>
+        <w:t>。Jev 适配器已经实测（见 4.2 节）。项目另提供 Streamlit 演示界面（</w:t>
       </w:r>
       <w:r>
         <w:t>app/demo.py</w:t>
@@ -1545,6 +1552,11 @@
       </w:r>
       <w:r>
         <w:t>）。</w:t>
+      </w:r>
+    </w:p>
+    <w:p>
+      <w:r>
+        <w:t>需要说明的是，大模型决定的是“用哪些工具、按什么顺序、何时停止、失败后补哪几步”，40 例中第一轮共出现 9 种不同的计划；每个工具内部的算法与阈值、工具之间的依赖则由代码固定，计划中的参数字段不被真实工具读取。这是有意的设计：阈值敏感性分析表明 |log2FC| 阈值会改变 Top-10，让大模型在看到结果后调阈值等于事后调参；此前让大模型挑选方法也比固定 B2 低 0.11 NS-AUC。</w:t>
       </w:r>
     </w:p>
     <w:p>

</xml_diff>

<commit_message>
deliverables: rebuild deck v7 and report v5 (Word 12 pages, LaTeX 11 pages)
Rendered and inspected; LaTeX QA, deliverable check and tests pass.

Co-Authored-By: Claude Opus 5.5 <noreply@anthropic.com>
</commit_message>
<xml_diff>
--- a/deliverables/药物重定位Agent_课程设计报告_v5.docx
+++ b/deliverables/药物重定位Agent_课程设计报告_v5.docx
@@ -1561,6 +1561,1076 @@
     </w:p>
     <w:p>
       <w:pPr>
+        <w:pStyle w:val="Heading2"/>
+      </w:pPr>
+      <w:r>
+        <w:t>大模型的作用：去掉大模型会怎样</w:t>
+      </w:r>
+    </w:p>
+    <w:p>
+      <w:r>
+        <w:t>所有数值计算都不经过大模型，因此去掉大模型后，Benchmark 分数（B3/B4 的 NS-AUC）、LUAD Top-10 排名、通路富集与阈值敏感性结果一个数字都不会变。反过来，让大模型碰数值的两次尝试都更差：五分区方法选择中大模型所选方法比固定 B2 低 0.11 NS-AUC；让它直接判断药物—疾病对时，开卷 AUC 0.567 来自对教科书适应症的记忆，属于泄漏。因此本项目不主张“用了大模型预测更准”。</w:t>
+      </w:r>
+    </w:p>
+    <w:p>
+      <w:r>
+        <w:t>大模型的作用在于处理自由文本。下表为同一冻结用例上规则版与大模型版的对比：</w:t>
+      </w:r>
+    </w:p>
+    <w:tbl>
+      <w:tblPr>
+        <w:tblW w:type="auto" w:w="0"/>
+        <w:tblLayout w:type="fixed"/>
+        <w:tblLook w:firstColumn="1" w:firstRow="1" w:lastColumn="0" w:lastRow="0" w:noHBand="0" w:noVBand="1" w:val="04A0"/>
+      </w:tblPr>
+      <w:tblGrid>
+        <w:gridCol w:w="2498"/>
+        <w:gridCol w:w="2498"/>
+        <w:gridCol w:w="2498"/>
+        <w:gridCol w:w="2498"/>
+      </w:tblGrid>
+      <w:tr>
+        <w:trPr>
+          <w:tblHeader w:val="true"/>
+        </w:trPr>
+        <w:tc>
+          <w:tcPr>
+            <w:tcW w:type="dxa" w:w="2466"/>
+            <w:vAlign w:val="center"/>
+            <w:shd w:fill="18384E"/>
+            <w:tcBorders>
+              <w:top w:val="single" w:sz="4" w:color="D9D9D9"/>
+              <w:left w:val="single" w:sz="4" w:color="D9D9D9"/>
+              <w:bottom w:val="single" w:sz="4" w:color="D9D9D9"/>
+              <w:right w:val="single" w:sz="4" w:color="D9D9D9"/>
+            </w:tcBorders>
+            <w:tcMar>
+              <w:top w:w="75" w:type="dxa"/>
+              <w:left w:w="75" w:type="dxa"/>
+              <w:bottom w:w="75" w:type="dxa"/>
+              <w:right w:w="75" w:type="dxa"/>
+            </w:tcMar>
+          </w:tcPr>
+          <w:p>
+            <w:pPr>
+              <w:spacing w:after="0"/>
+            </w:pPr>
+            <w:r>
+              <w:rPr>
+                <w:b/>
+                <w:color w:val="FFFFFF"/>
+                <w:sz w:val="17"/>
+              </w:rPr>
+            </w:r>
+            <w:r>
+              <w:rPr>
+                <w:b/>
+                <w:color w:val="FFFFFF"/>
+                <w:sz w:val="17"/>
+              </w:rPr>
+              <w:t>环节</w:t>
+            </w:r>
+          </w:p>
+        </w:tc>
+        <w:tc>
+          <w:tcPr>
+            <w:tcW w:type="dxa" w:w="2466"/>
+            <w:vAlign w:val="center"/>
+            <w:shd w:fill="18384E"/>
+            <w:tcBorders>
+              <w:top w:val="single" w:sz="4" w:color="D9D9D9"/>
+              <w:left w:val="single" w:sz="4" w:color="D9D9D9"/>
+              <w:bottom w:val="single" w:sz="4" w:color="D9D9D9"/>
+              <w:right w:val="single" w:sz="4" w:color="D9D9D9"/>
+            </w:tcBorders>
+            <w:tcMar>
+              <w:top w:w="75" w:type="dxa"/>
+              <w:left w:w="75" w:type="dxa"/>
+              <w:bottom w:w="75" w:type="dxa"/>
+              <w:right w:w="75" w:type="dxa"/>
+            </w:tcMar>
+          </w:tcPr>
+          <w:p>
+            <w:pPr>
+              <w:spacing w:after="0"/>
+              <w:jc w:val="center"/>
+            </w:pPr>
+            <w:r>
+              <w:rPr>
+                <w:b/>
+                <w:color w:val="FFFFFF"/>
+                <w:sz w:val="17"/>
+              </w:rPr>
+            </w:r>
+            <w:r>
+              <w:rPr>
+                <w:b/>
+                <w:color w:val="FFFFFF"/>
+                <w:sz w:val="17"/>
+              </w:rPr>
+              <w:t>只用规则</w:t>
+            </w:r>
+          </w:p>
+        </w:tc>
+        <w:tc>
+          <w:tcPr>
+            <w:tcW w:type="dxa" w:w="2466"/>
+            <w:vAlign w:val="center"/>
+            <w:shd w:fill="18384E"/>
+            <w:tcBorders>
+              <w:top w:val="single" w:sz="4" w:color="D9D9D9"/>
+              <w:left w:val="single" w:sz="4" w:color="D9D9D9"/>
+              <w:bottom w:val="single" w:sz="4" w:color="D9D9D9"/>
+              <w:right w:val="single" w:sz="4" w:color="D9D9D9"/>
+            </w:tcBorders>
+            <w:tcMar>
+              <w:top w:w="75" w:type="dxa"/>
+              <w:left w:w="75" w:type="dxa"/>
+              <w:bottom w:w="75" w:type="dxa"/>
+              <w:right w:w="75" w:type="dxa"/>
+            </w:tcMar>
+          </w:tcPr>
+          <w:p>
+            <w:pPr>
+              <w:spacing w:after="0"/>
+              <w:jc w:val="center"/>
+            </w:pPr>
+            <w:r>
+              <w:rPr>
+                <w:b/>
+                <w:color w:val="FFFFFF"/>
+                <w:sz w:val="17"/>
+              </w:rPr>
+            </w:r>
+            <w:r>
+              <w:rPr>
+                <w:b/>
+                <w:color w:val="FFFFFF"/>
+                <w:sz w:val="17"/>
+              </w:rPr>
+              <w:t>用大模型</w:t>
+            </w:r>
+          </w:p>
+        </w:tc>
+        <w:tc>
+          <w:tcPr>
+            <w:tcW w:type="dxa" w:w="2466"/>
+            <w:vAlign w:val="center"/>
+            <w:shd w:fill="18384E"/>
+            <w:tcBorders>
+              <w:top w:val="single" w:sz="4" w:color="D9D9D9"/>
+              <w:left w:val="single" w:sz="4" w:color="D9D9D9"/>
+              <w:bottom w:val="single" w:sz="4" w:color="D9D9D9"/>
+              <w:right w:val="single" w:sz="4" w:color="D9D9D9"/>
+            </w:tcBorders>
+            <w:tcMar>
+              <w:top w:w="75" w:type="dxa"/>
+              <w:left w:w="75" w:type="dxa"/>
+              <w:bottom w:w="75" w:type="dxa"/>
+              <w:right w:w="75" w:type="dxa"/>
+            </w:tcMar>
+          </w:tcPr>
+          <w:p>
+            <w:pPr>
+              <w:spacing w:after="0"/>
+              <w:jc w:val="center"/>
+            </w:pPr>
+            <w:r>
+              <w:rPr>
+                <w:b/>
+                <w:color w:val="FFFFFF"/>
+                <w:sz w:val="17"/>
+              </w:rPr>
+            </w:r>
+            <w:r>
+              <w:rPr>
+                <w:b/>
+                <w:color w:val="FFFFFF"/>
+                <w:sz w:val="17"/>
+              </w:rPr>
+              <w:t>说明</w:t>
+            </w:r>
+          </w:p>
+        </w:tc>
+      </w:tr>
+      <w:tr>
+        <w:tc>
+          <w:tcPr>
+            <w:tcW w:type="dxa" w:w="2466"/>
+            <w:vAlign w:val="center"/>
+            <w:tcBorders>
+              <w:top w:val="single" w:sz="4" w:color="D9D9D9"/>
+              <w:left w:val="single" w:sz="4" w:color="D9D9D9"/>
+              <w:bottom w:val="single" w:sz="4" w:color="D9D9D9"/>
+              <w:right w:val="single" w:sz="4" w:color="D9D9D9"/>
+            </w:tcBorders>
+            <w:tcMar>
+              <w:top w:w="75" w:type="dxa"/>
+              <w:left w:w="75" w:type="dxa"/>
+              <w:bottom w:w="75" w:type="dxa"/>
+              <w:right w:w="75" w:type="dxa"/>
+            </w:tcMar>
+          </w:tcPr>
+          <w:p>
+            <w:pPr>
+              <w:spacing w:after="0"/>
+            </w:pPr>
+            <w:r>
+              <w:rPr>
+                <w:sz w:val="17"/>
+              </w:rPr>
+            </w:r>
+            <w:r>
+              <w:rPr>
+                <w:sz w:val="17"/>
+              </w:rPr>
+              <w:t>单步规划（100 例 holdout）</w:t>
+            </w:r>
+          </w:p>
+        </w:tc>
+        <w:tc>
+          <w:tcPr>
+            <w:tcW w:type="dxa" w:w="2466"/>
+            <w:vAlign w:val="center"/>
+            <w:tcBorders>
+              <w:top w:val="single" w:sz="4" w:color="D9D9D9"/>
+              <w:left w:val="single" w:sz="4" w:color="D9D9D9"/>
+              <w:bottom w:val="single" w:sz="4" w:color="D9D9D9"/>
+              <w:right w:val="single" w:sz="4" w:color="D9D9D9"/>
+            </w:tcBorders>
+            <w:tcMar>
+              <w:top w:w="75" w:type="dxa"/>
+              <w:left w:w="75" w:type="dxa"/>
+              <w:bottom w:w="75" w:type="dxa"/>
+              <w:right w:w="75" w:type="dxa"/>
+            </w:tcMar>
+          </w:tcPr>
+          <w:p>
+            <w:pPr>
+              <w:spacing w:after="0"/>
+              <w:jc w:val="center"/>
+            </w:pPr>
+            <w:r>
+              <w:rPr>
+                <w:sz w:val="17"/>
+              </w:rPr>
+            </w:r>
+            <w:r>
+              <w:rPr>
+                <w:sz w:val="17"/>
+              </w:rPr>
+              <w:t>90/100</w:t>
+            </w:r>
+          </w:p>
+        </w:tc>
+        <w:tc>
+          <w:tcPr>
+            <w:tcW w:type="dxa" w:w="2466"/>
+            <w:vAlign w:val="center"/>
+            <w:tcBorders>
+              <w:top w:val="single" w:sz="4" w:color="D9D9D9"/>
+              <w:left w:val="single" w:sz="4" w:color="D9D9D9"/>
+              <w:bottom w:val="single" w:sz="4" w:color="D9D9D9"/>
+              <w:right w:val="single" w:sz="4" w:color="D9D9D9"/>
+            </w:tcBorders>
+            <w:tcMar>
+              <w:top w:w="75" w:type="dxa"/>
+              <w:left w:w="75" w:type="dxa"/>
+              <w:bottom w:w="75" w:type="dxa"/>
+              <w:right w:w="75" w:type="dxa"/>
+            </w:tcMar>
+          </w:tcPr>
+          <w:p>
+            <w:pPr>
+              <w:spacing w:after="0"/>
+              <w:jc w:val="center"/>
+            </w:pPr>
+            <w:r>
+              <w:rPr>
+                <w:sz w:val="17"/>
+              </w:rPr>
+            </w:r>
+            <w:r>
+              <w:rPr>
+                <w:sz w:val="17"/>
+              </w:rPr>
+              <w:t>98/100</w:t>
+            </w:r>
+          </w:p>
+        </w:tc>
+        <w:tc>
+          <w:tcPr>
+            <w:tcW w:type="dxa" w:w="2466"/>
+            <w:vAlign w:val="center"/>
+            <w:tcBorders>
+              <w:top w:val="single" w:sz="4" w:color="D9D9D9"/>
+              <w:left w:val="single" w:sz="4" w:color="D9D9D9"/>
+              <w:bottom w:val="single" w:sz="4" w:color="D9D9D9"/>
+              <w:right w:val="single" w:sz="4" w:color="D9D9D9"/>
+            </w:tcBorders>
+            <w:tcMar>
+              <w:top w:w="75" w:type="dxa"/>
+              <w:left w:w="75" w:type="dxa"/>
+              <w:bottom w:w="75" w:type="dxa"/>
+              <w:right w:w="75" w:type="dxa"/>
+            </w:tcMar>
+          </w:tcPr>
+          <w:p>
+            <w:pPr>
+              <w:spacing w:after="0"/>
+              <w:jc w:val="center"/>
+            </w:pPr>
+            <w:r>
+              <w:rPr>
+                <w:sz w:val="17"/>
+              </w:rPr>
+            </w:r>
+            <w:r>
+              <w:rPr>
+                <w:sz w:val="17"/>
+              </w:rPr>
+              <w:t>规则换个说法就识别不了</w:t>
+            </w:r>
+          </w:p>
+        </w:tc>
+      </w:tr>
+      <w:tr>
+        <w:tc>
+          <w:tcPr>
+            <w:tcW w:type="dxa" w:w="2466"/>
+            <w:vAlign w:val="center"/>
+            <w:shd w:fill="F2F6F8"/>
+            <w:tcBorders>
+              <w:top w:val="single" w:sz="4" w:color="D9D9D9"/>
+              <w:left w:val="single" w:sz="4" w:color="D9D9D9"/>
+              <w:bottom w:val="single" w:sz="4" w:color="D9D9D9"/>
+              <w:right w:val="single" w:sz="4" w:color="D9D9D9"/>
+            </w:tcBorders>
+            <w:tcMar>
+              <w:top w:w="75" w:type="dxa"/>
+              <w:left w:w="75" w:type="dxa"/>
+              <w:bottom w:w="75" w:type="dxa"/>
+              <w:right w:w="75" w:type="dxa"/>
+            </w:tcMar>
+          </w:tcPr>
+          <w:p>
+            <w:pPr>
+              <w:spacing w:after="0"/>
+            </w:pPr>
+            <w:r>
+              <w:rPr>
+                <w:sz w:val="17"/>
+              </w:rPr>
+            </w:r>
+            <w:r>
+              <w:rPr>
+                <w:sz w:val="17"/>
+              </w:rPr>
+              <w:t>多步规划（40 例）</w:t>
+            </w:r>
+          </w:p>
+        </w:tc>
+        <w:tc>
+          <w:tcPr>
+            <w:tcW w:type="dxa" w:w="2466"/>
+            <w:vAlign w:val="center"/>
+            <w:shd w:fill="F2F6F8"/>
+            <w:tcBorders>
+              <w:top w:val="single" w:sz="4" w:color="D9D9D9"/>
+              <w:left w:val="single" w:sz="4" w:color="D9D9D9"/>
+              <w:bottom w:val="single" w:sz="4" w:color="D9D9D9"/>
+              <w:right w:val="single" w:sz="4" w:color="D9D9D9"/>
+            </w:tcBorders>
+            <w:tcMar>
+              <w:top w:w="75" w:type="dxa"/>
+              <w:left w:w="75" w:type="dxa"/>
+              <w:bottom w:w="75" w:type="dxa"/>
+              <w:right w:w="75" w:type="dxa"/>
+            </w:tcMar>
+          </w:tcPr>
+          <w:p>
+            <w:pPr>
+              <w:spacing w:after="0"/>
+              <w:jc w:val="center"/>
+            </w:pPr>
+            <w:r>
+              <w:rPr>
+                <w:sz w:val="17"/>
+              </w:rPr>
+            </w:r>
+            <w:r>
+              <w:rPr>
+                <w:sz w:val="17"/>
+              </w:rPr>
+              <w:t>30/40</w:t>
+            </w:r>
+          </w:p>
+        </w:tc>
+        <w:tc>
+          <w:tcPr>
+            <w:tcW w:type="dxa" w:w="2466"/>
+            <w:vAlign w:val="center"/>
+            <w:shd w:fill="F2F6F8"/>
+            <w:tcBorders>
+              <w:top w:val="single" w:sz="4" w:color="D9D9D9"/>
+              <w:left w:val="single" w:sz="4" w:color="D9D9D9"/>
+              <w:bottom w:val="single" w:sz="4" w:color="D9D9D9"/>
+              <w:right w:val="single" w:sz="4" w:color="D9D9D9"/>
+            </w:tcBorders>
+            <w:tcMar>
+              <w:top w:w="75" w:type="dxa"/>
+              <w:left w:w="75" w:type="dxa"/>
+              <w:bottom w:w="75" w:type="dxa"/>
+              <w:right w:w="75" w:type="dxa"/>
+            </w:tcMar>
+          </w:tcPr>
+          <w:p>
+            <w:pPr>
+              <w:spacing w:after="0"/>
+              <w:jc w:val="center"/>
+            </w:pPr>
+            <w:r>
+              <w:rPr>
+                <w:sz w:val="17"/>
+              </w:rPr>
+            </w:r>
+            <w:r>
+              <w:rPr>
+                <w:sz w:val="17"/>
+              </w:rPr>
+              <w:t>36/40</w:t>
+            </w:r>
+          </w:p>
+        </w:tc>
+        <w:tc>
+          <w:tcPr>
+            <w:tcW w:type="dxa" w:w="2466"/>
+            <w:vAlign w:val="center"/>
+            <w:shd w:fill="F2F6F8"/>
+            <w:tcBorders>
+              <w:top w:val="single" w:sz="4" w:color="D9D9D9"/>
+              <w:left w:val="single" w:sz="4" w:color="D9D9D9"/>
+              <w:bottom w:val="single" w:sz="4" w:color="D9D9D9"/>
+              <w:right w:val="single" w:sz="4" w:color="D9D9D9"/>
+            </w:tcBorders>
+            <w:tcMar>
+              <w:top w:w="75" w:type="dxa"/>
+              <w:left w:w="75" w:type="dxa"/>
+              <w:bottom w:w="75" w:type="dxa"/>
+              <w:right w:w="75" w:type="dxa"/>
+            </w:tcMar>
+          </w:tcPr>
+          <w:p>
+            <w:pPr>
+              <w:spacing w:after="0"/>
+              <w:jc w:val="center"/>
+            </w:pPr>
+            <w:r>
+              <w:rPr>
+                <w:sz w:val="17"/>
+              </w:rPr>
+            </w:r>
+            <w:r>
+              <w:rPr>
+                <w:sz w:val="17"/>
+              </w:rPr>
+              <w:t>差距主要在“部分任务”</w:t>
+            </w:r>
+          </w:p>
+        </w:tc>
+      </w:tr>
+      <w:tr>
+        <w:tc>
+          <w:tcPr>
+            <w:tcW w:type="dxa" w:w="2466"/>
+            <w:vAlign w:val="center"/>
+            <w:tcBorders>
+              <w:top w:val="single" w:sz="4" w:color="D9D9D9"/>
+              <w:left w:val="single" w:sz="4" w:color="D9D9D9"/>
+              <w:bottom w:val="single" w:sz="4" w:color="D9D9D9"/>
+              <w:right w:val="single" w:sz="4" w:color="D9D9D9"/>
+            </w:tcBorders>
+            <w:tcMar>
+              <w:top w:w="75" w:type="dxa"/>
+              <w:left w:w="75" w:type="dxa"/>
+              <w:bottom w:w="75" w:type="dxa"/>
+              <w:right w:w="75" w:type="dxa"/>
+            </w:tcMar>
+          </w:tcPr>
+          <w:p>
+            <w:pPr>
+              <w:spacing w:after="0"/>
+            </w:pPr>
+            <w:r>
+              <w:rPr>
+                <w:sz w:val="17"/>
+              </w:rPr>
+            </w:r>
+            <w:r>
+              <w:rPr>
+                <w:sz w:val="17"/>
+              </w:rPr>
+              <w:t>其中“部分任务”</w:t>
+            </w:r>
+          </w:p>
+        </w:tc>
+        <w:tc>
+          <w:tcPr>
+            <w:tcW w:type="dxa" w:w="2466"/>
+            <w:vAlign w:val="center"/>
+            <w:tcBorders>
+              <w:top w:val="single" w:sz="4" w:color="D9D9D9"/>
+              <w:left w:val="single" w:sz="4" w:color="D9D9D9"/>
+              <w:bottom w:val="single" w:sz="4" w:color="D9D9D9"/>
+              <w:right w:val="single" w:sz="4" w:color="D9D9D9"/>
+            </w:tcBorders>
+            <w:tcMar>
+              <w:top w:w="75" w:type="dxa"/>
+              <w:left w:w="75" w:type="dxa"/>
+              <w:bottom w:w="75" w:type="dxa"/>
+              <w:right w:w="75" w:type="dxa"/>
+            </w:tcMar>
+          </w:tcPr>
+          <w:p>
+            <w:pPr>
+              <w:spacing w:after="0"/>
+              <w:jc w:val="center"/>
+            </w:pPr>
+            <w:r>
+              <w:rPr>
+                <w:sz w:val="17"/>
+              </w:rPr>
+            </w:r>
+            <w:r>
+              <w:rPr>
+                <w:sz w:val="17"/>
+              </w:rPr>
+              <w:t>2/8</w:t>
+            </w:r>
+          </w:p>
+        </w:tc>
+        <w:tc>
+          <w:tcPr>
+            <w:tcW w:type="dxa" w:w="2466"/>
+            <w:vAlign w:val="center"/>
+            <w:tcBorders>
+              <w:top w:val="single" w:sz="4" w:color="D9D9D9"/>
+              <w:left w:val="single" w:sz="4" w:color="D9D9D9"/>
+              <w:bottom w:val="single" w:sz="4" w:color="D9D9D9"/>
+              <w:right w:val="single" w:sz="4" w:color="D9D9D9"/>
+            </w:tcBorders>
+            <w:tcMar>
+              <w:top w:w="75" w:type="dxa"/>
+              <w:left w:w="75" w:type="dxa"/>
+              <w:bottom w:w="75" w:type="dxa"/>
+              <w:right w:w="75" w:type="dxa"/>
+            </w:tcMar>
+          </w:tcPr>
+          <w:p>
+            <w:pPr>
+              <w:spacing w:after="0"/>
+              <w:jc w:val="center"/>
+            </w:pPr>
+            <w:r>
+              <w:rPr>
+                <w:sz w:val="17"/>
+              </w:rPr>
+            </w:r>
+            <w:r>
+              <w:rPr>
+                <w:sz w:val="17"/>
+              </w:rPr>
+              <w:t>8/8</w:t>
+            </w:r>
+          </w:p>
+        </w:tc>
+        <w:tc>
+          <w:tcPr>
+            <w:tcW w:type="dxa" w:w="2466"/>
+            <w:vAlign w:val="center"/>
+            <w:tcBorders>
+              <w:top w:val="single" w:sz="4" w:color="D9D9D9"/>
+              <w:left w:val="single" w:sz="4" w:color="D9D9D9"/>
+              <w:bottom w:val="single" w:sz="4" w:color="D9D9D9"/>
+              <w:right w:val="single" w:sz="4" w:color="D9D9D9"/>
+            </w:tcBorders>
+            <w:tcMar>
+              <w:top w:w="75" w:type="dxa"/>
+              <w:left w:w="75" w:type="dxa"/>
+              <w:bottom w:w="75" w:type="dxa"/>
+              <w:right w:w="75" w:type="dxa"/>
+            </w:tcMar>
+          </w:tcPr>
+          <w:p>
+            <w:pPr>
+              <w:spacing w:after="0"/>
+              <w:jc w:val="center"/>
+            </w:pPr>
+            <w:r>
+              <w:rPr>
+                <w:sz w:val="17"/>
+              </w:rPr>
+            </w:r>
+            <w:r>
+              <w:rPr>
+                <w:sz w:val="17"/>
+              </w:rPr>
+              <w:t>规则把“只看通路”“只做质控”也跑成全流程</w:t>
+            </w:r>
+          </w:p>
+        </w:tc>
+      </w:tr>
+      <w:tr>
+        <w:tc>
+          <w:tcPr>
+            <w:tcW w:type="dxa" w:w="2466"/>
+            <w:vAlign w:val="center"/>
+            <w:shd w:fill="F2F6F8"/>
+            <w:tcBorders>
+              <w:top w:val="single" w:sz="4" w:color="D9D9D9"/>
+              <w:left w:val="single" w:sz="4" w:color="D9D9D9"/>
+              <w:bottom w:val="single" w:sz="4" w:color="D9D9D9"/>
+              <w:right w:val="single" w:sz="4" w:color="D9D9D9"/>
+            </w:tcBorders>
+            <w:tcMar>
+              <w:top w:w="75" w:type="dxa"/>
+              <w:left w:w="75" w:type="dxa"/>
+              <w:bottom w:w="75" w:type="dxa"/>
+              <w:right w:w="75" w:type="dxa"/>
+            </w:tcMar>
+          </w:tcPr>
+          <w:p>
+            <w:pPr>
+              <w:spacing w:after="0"/>
+            </w:pPr>
+            <w:r>
+              <w:rPr>
+                <w:sz w:val="17"/>
+              </w:rPr>
+            </w:r>
+            <w:r>
+              <w:rPr>
+                <w:sz w:val="17"/>
+              </w:rPr>
+              <w:t>换说法重复运行（10 次）</w:t>
+            </w:r>
+          </w:p>
+        </w:tc>
+        <w:tc>
+          <w:tcPr>
+            <w:tcW w:type="dxa" w:w="2466"/>
+            <w:vAlign w:val="center"/>
+            <w:shd w:fill="F2F6F8"/>
+            <w:tcBorders>
+              <w:top w:val="single" w:sz="4" w:color="D9D9D9"/>
+              <w:left w:val="single" w:sz="4" w:color="D9D9D9"/>
+              <w:bottom w:val="single" w:sz="4" w:color="D9D9D9"/>
+              <w:right w:val="single" w:sz="4" w:color="D9D9D9"/>
+            </w:tcBorders>
+            <w:tcMar>
+              <w:top w:w="75" w:type="dxa"/>
+              <w:left w:w="75" w:type="dxa"/>
+              <w:bottom w:w="75" w:type="dxa"/>
+              <w:right w:w="75" w:type="dxa"/>
+            </w:tcMar>
+          </w:tcPr>
+          <w:p>
+            <w:pPr>
+              <w:spacing w:after="0"/>
+              <w:jc w:val="center"/>
+            </w:pPr>
+            <w:r>
+              <w:rPr>
+                <w:sz w:val="17"/>
+              </w:rPr>
+            </w:r>
+            <w:r>
+              <w:rPr>
+                <w:sz w:val="17"/>
+              </w:rPr>
+              <w:t>8/10 完成</w:t>
+            </w:r>
+          </w:p>
+        </w:tc>
+        <w:tc>
+          <w:tcPr>
+            <w:tcW w:type="dxa" w:w="2466"/>
+            <w:vAlign w:val="center"/>
+            <w:shd w:fill="F2F6F8"/>
+            <w:tcBorders>
+              <w:top w:val="single" w:sz="4" w:color="D9D9D9"/>
+              <w:left w:val="single" w:sz="4" w:color="D9D9D9"/>
+              <w:bottom w:val="single" w:sz="4" w:color="D9D9D9"/>
+              <w:right w:val="single" w:sz="4" w:color="D9D9D9"/>
+            </w:tcBorders>
+            <w:tcMar>
+              <w:top w:w="75" w:type="dxa"/>
+              <w:left w:w="75" w:type="dxa"/>
+              <w:bottom w:w="75" w:type="dxa"/>
+              <w:right w:w="75" w:type="dxa"/>
+            </w:tcMar>
+          </w:tcPr>
+          <w:p>
+            <w:pPr>
+              <w:spacing w:after="0"/>
+              <w:jc w:val="center"/>
+            </w:pPr>
+            <w:r>
+              <w:rPr>
+                <w:sz w:val="17"/>
+              </w:rPr>
+            </w:r>
+            <w:r>
+              <w:rPr>
+                <w:sz w:val="17"/>
+              </w:rPr>
+              <w:t>10/10 完成</w:t>
+            </w:r>
+          </w:p>
+        </w:tc>
+        <w:tc>
+          <w:tcPr>
+            <w:tcW w:type="dxa" w:w="2466"/>
+            <w:vAlign w:val="center"/>
+            <w:shd w:fill="F2F6F8"/>
+            <w:tcBorders>
+              <w:top w:val="single" w:sz="4" w:color="D9D9D9"/>
+              <w:left w:val="single" w:sz="4" w:color="D9D9D9"/>
+              <w:bottom w:val="single" w:sz="4" w:color="D9D9D9"/>
+              <w:right w:val="single" w:sz="4" w:color="D9D9D9"/>
+            </w:tcBorders>
+            <w:tcMar>
+              <w:top w:w="75" w:type="dxa"/>
+              <w:left w:w="75" w:type="dxa"/>
+              <w:bottom w:w="75" w:type="dxa"/>
+              <w:right w:w="75" w:type="dxa"/>
+            </w:tcMar>
+          </w:tcPr>
+          <w:p>
+            <w:pPr>
+              <w:spacing w:after="0"/>
+              <w:jc w:val="center"/>
+            </w:pPr>
+            <w:r>
+              <w:rPr>
+                <w:sz w:val="17"/>
+              </w:rPr>
+            </w:r>
+            <w:r>
+              <w:rPr>
+                <w:sz w:val="17"/>
+              </w:rPr>
+              <w:t>规则遇到没见过的措辞转人工</w:t>
+            </w:r>
+          </w:p>
+        </w:tc>
+      </w:tr>
+      <w:tr>
+        <w:tc>
+          <w:tcPr>
+            <w:tcW w:type="dxa" w:w="2466"/>
+            <w:vAlign w:val="center"/>
+            <w:tcBorders>
+              <w:top w:val="single" w:sz="4" w:color="D9D9D9"/>
+              <w:left w:val="single" w:sz="4" w:color="D9D9D9"/>
+              <w:bottom w:val="single" w:sz="4" w:color="D9D9D9"/>
+              <w:right w:val="single" w:sz="4" w:color="D9D9D9"/>
+            </w:tcBorders>
+            <w:tcMar>
+              <w:top w:w="75" w:type="dxa"/>
+              <w:left w:w="75" w:type="dxa"/>
+              <w:bottom w:w="75" w:type="dxa"/>
+              <w:right w:w="75" w:type="dxa"/>
+            </w:tcMar>
+          </w:tcPr>
+          <w:p>
+            <w:pPr>
+              <w:spacing w:after="0"/>
+            </w:pPr>
+            <w:r>
+              <w:rPr>
+                <w:sz w:val="17"/>
+              </w:rPr>
+            </w:r>
+            <w:r>
+              <w:rPr>
+                <w:sz w:val="17"/>
+              </w:rPr>
+              <w:t>中文风险备注判断（40 例）</w:t>
+            </w:r>
+          </w:p>
+        </w:tc>
+        <w:tc>
+          <w:tcPr>
+            <w:tcW w:type="dxa" w:w="2466"/>
+            <w:vAlign w:val="center"/>
+            <w:tcBorders>
+              <w:top w:val="single" w:sz="4" w:color="D9D9D9"/>
+              <w:left w:val="single" w:sz="4" w:color="D9D9D9"/>
+              <w:bottom w:val="single" w:sz="4" w:color="D9D9D9"/>
+              <w:right w:val="single" w:sz="4" w:color="D9D9D9"/>
+            </w:tcBorders>
+            <w:tcMar>
+              <w:top w:w="75" w:type="dxa"/>
+              <w:left w:w="75" w:type="dxa"/>
+              <w:bottom w:w="75" w:type="dxa"/>
+              <w:right w:w="75" w:type="dxa"/>
+            </w:tcMar>
+          </w:tcPr>
+          <w:p>
+            <w:pPr>
+              <w:spacing w:after="0"/>
+              <w:jc w:val="center"/>
+            </w:pPr>
+            <w:r>
+              <w:rPr>
+                <w:sz w:val="17"/>
+              </w:rPr>
+            </w:r>
+            <w:r>
+              <w:rPr>
+                <w:sz w:val="17"/>
+              </w:rPr>
+              <w:t>20/40</w:t>
+            </w:r>
+          </w:p>
+        </w:tc>
+        <w:tc>
+          <w:tcPr>
+            <w:tcW w:type="dxa" w:w="2466"/>
+            <w:vAlign w:val="center"/>
+            <w:tcBorders>
+              <w:top w:val="single" w:sz="4" w:color="D9D9D9"/>
+              <w:left w:val="single" w:sz="4" w:color="D9D9D9"/>
+              <w:bottom w:val="single" w:sz="4" w:color="D9D9D9"/>
+              <w:right w:val="single" w:sz="4" w:color="D9D9D9"/>
+            </w:tcBorders>
+            <w:tcMar>
+              <w:top w:w="75" w:type="dxa"/>
+              <w:left w:w="75" w:type="dxa"/>
+              <w:bottom w:w="75" w:type="dxa"/>
+              <w:right w:w="75" w:type="dxa"/>
+            </w:tcMar>
+          </w:tcPr>
+          <w:p>
+            <w:pPr>
+              <w:spacing w:after="0"/>
+              <w:jc w:val="center"/>
+            </w:pPr>
+            <w:r>
+              <w:rPr>
+                <w:sz w:val="17"/>
+              </w:rPr>
+            </w:r>
+            <w:r>
+              <w:rPr>
+                <w:sz w:val="17"/>
+              </w:rPr>
+              <w:t>39/40（混合层）</w:t>
+            </w:r>
+          </w:p>
+        </w:tc>
+        <w:tc>
+          <w:tcPr>
+            <w:tcW w:type="dxa" w:w="2466"/>
+            <w:vAlign w:val="center"/>
+            <w:tcBorders>
+              <w:top w:val="single" w:sz="4" w:color="D9D9D9"/>
+              <w:left w:val="single" w:sz="4" w:color="D9D9D9"/>
+              <w:bottom w:val="single" w:sz="4" w:color="D9D9D9"/>
+              <w:right w:val="single" w:sz="4" w:color="D9D9D9"/>
+            </w:tcBorders>
+            <w:tcMar>
+              <w:top w:w="75" w:type="dxa"/>
+              <w:left w:w="75" w:type="dxa"/>
+              <w:bottom w:w="75" w:type="dxa"/>
+              <w:right w:w="75" w:type="dxa"/>
+            </w:tcMar>
+          </w:tcPr>
+          <w:p>
+            <w:pPr>
+              <w:spacing w:after="0"/>
+              <w:jc w:val="center"/>
+            </w:pPr>
+            <w:r>
+              <w:rPr>
+                <w:sz w:val="17"/>
+              </w:rPr>
+            </w:r>
+            <w:r>
+              <w:rPr>
+                <w:sz w:val="17"/>
+              </w:rPr>
+              <w:t>关键词覆盖不到新的风险说法</w:t>
+            </w:r>
+          </w:p>
+        </w:tc>
+      </w:tr>
+      <w:tr>
+        <w:tc>
+          <w:tcPr>
+            <w:tcW w:type="dxa" w:w="2466"/>
+            <w:vAlign w:val="center"/>
+            <w:shd w:fill="F2F6F8"/>
+            <w:tcBorders>
+              <w:top w:val="single" w:sz="4" w:color="D9D9D9"/>
+              <w:left w:val="single" w:sz="4" w:color="D9D9D9"/>
+              <w:bottom w:val="single" w:sz="4" w:color="D9D9D9"/>
+              <w:right w:val="single" w:sz="4" w:color="D9D9D9"/>
+            </w:tcBorders>
+            <w:tcMar>
+              <w:top w:w="75" w:type="dxa"/>
+              <w:left w:w="75" w:type="dxa"/>
+              <w:bottom w:w="75" w:type="dxa"/>
+              <w:right w:w="75" w:type="dxa"/>
+            </w:tcMar>
+          </w:tcPr>
+          <w:p>
+            <w:pPr>
+              <w:spacing w:after="0"/>
+            </w:pPr>
+            <w:r>
+              <w:rPr>
+                <w:sz w:val="17"/>
+              </w:rPr>
+            </w:r>
+            <w:r>
+              <w:rPr>
+                <w:sz w:val="17"/>
+              </w:rPr>
+              <w:t>越权请求拒绝（8 例）</w:t>
+            </w:r>
+          </w:p>
+        </w:tc>
+        <w:tc>
+          <w:tcPr>
+            <w:tcW w:type="dxa" w:w="2466"/>
+            <w:vAlign w:val="center"/>
+            <w:shd w:fill="F2F6F8"/>
+            <w:tcBorders>
+              <w:top w:val="single" w:sz="4" w:color="D9D9D9"/>
+              <w:left w:val="single" w:sz="4" w:color="D9D9D9"/>
+              <w:bottom w:val="single" w:sz="4" w:color="D9D9D9"/>
+              <w:right w:val="single" w:sz="4" w:color="D9D9D9"/>
+            </w:tcBorders>
+            <w:tcMar>
+              <w:top w:w="75" w:type="dxa"/>
+              <w:left w:w="75" w:type="dxa"/>
+              <w:bottom w:w="75" w:type="dxa"/>
+              <w:right w:w="75" w:type="dxa"/>
+            </w:tcMar>
+          </w:tcPr>
+          <w:p>
+            <w:pPr>
+              <w:spacing w:after="0"/>
+              <w:jc w:val="center"/>
+            </w:pPr>
+            <w:r>
+              <w:rPr>
+                <w:sz w:val="17"/>
+              </w:rPr>
+            </w:r>
+            <w:r>
+              <w:rPr>
+                <w:sz w:val="17"/>
+              </w:rPr>
+              <w:t>7/8</w:t>
+            </w:r>
+          </w:p>
+        </w:tc>
+        <w:tc>
+          <w:tcPr>
+            <w:tcW w:type="dxa" w:w="2466"/>
+            <w:vAlign w:val="center"/>
+            <w:shd w:fill="F2F6F8"/>
+            <w:tcBorders>
+              <w:top w:val="single" w:sz="4" w:color="D9D9D9"/>
+              <w:left w:val="single" w:sz="4" w:color="D9D9D9"/>
+              <w:bottom w:val="single" w:sz="4" w:color="D9D9D9"/>
+              <w:right w:val="single" w:sz="4" w:color="D9D9D9"/>
+            </w:tcBorders>
+            <w:tcMar>
+              <w:top w:w="75" w:type="dxa"/>
+              <w:left w:w="75" w:type="dxa"/>
+              <w:bottom w:w="75" w:type="dxa"/>
+              <w:right w:w="75" w:type="dxa"/>
+            </w:tcMar>
+          </w:tcPr>
+          <w:p>
+            <w:pPr>
+              <w:spacing w:after="0"/>
+              <w:jc w:val="center"/>
+            </w:pPr>
+            <w:r>
+              <w:rPr>
+                <w:sz w:val="17"/>
+              </w:rPr>
+            </w:r>
+            <w:r>
+              <w:rPr>
+                <w:sz w:val="17"/>
+              </w:rPr>
+              <w:t>5/8</w:t>
+            </w:r>
+          </w:p>
+        </w:tc>
+        <w:tc>
+          <w:tcPr>
+            <w:tcW w:type="dxa" w:w="2466"/>
+            <w:vAlign w:val="center"/>
+            <w:shd w:fill="F2F6F8"/>
+            <w:tcBorders>
+              <w:top w:val="single" w:sz="4" w:color="D9D9D9"/>
+              <w:left w:val="single" w:sz="4" w:color="D9D9D9"/>
+              <w:bottom w:val="single" w:sz="4" w:color="D9D9D9"/>
+              <w:right w:val="single" w:sz="4" w:color="D9D9D9"/>
+            </w:tcBorders>
+            <w:tcMar>
+              <w:top w:w="75" w:type="dxa"/>
+              <w:left w:w="75" w:type="dxa"/>
+              <w:bottom w:w="75" w:type="dxa"/>
+              <w:right w:w="75" w:type="dxa"/>
+            </w:tcMar>
+          </w:tcPr>
+          <w:p>
+            <w:pPr>
+              <w:spacing w:after="0"/>
+              <w:jc w:val="center"/>
+            </w:pPr>
+            <w:r>
+              <w:rPr>
+                <w:sz w:val="17"/>
+              </w:rPr>
+            </w:r>
+            <w:r>
+              <w:rPr>
+                <w:b/>
+                <w:sz w:val="17"/>
+              </w:rPr>
+              <w:t>大模型更差</w:t>
+            </w:r>
+            <w:r>
+              <w:rPr>
+                <w:sz w:val="17"/>
+              </w:rPr>
+              <w:t>，靠代码层校验兜底</w:t>
+            </w:r>
+          </w:p>
+        </w:tc>
+      </w:tr>
+    </w:tbl>
+    <w:p>
+      <w:pPr>
+        <w:spacing w:after="40"/>
+      </w:pPr>
+    </w:p>
+    <w:p>
+      <w:r>
+        <w:t>大模型也带来新的风险：决策层 v1 中把完整决策交给它时，高风险误执行率为 0.150，固定规则为 0.033，因此采用“规则算结构化字段、大模型只读备注”的混合设计；多 Agent 文献审阅的 65 条引语中，事后复核有 13 条原样引用应排除。成本方面，40 例多步规划共用约 8.6 万 token。综上，算法决定结果是否正确，Agent 负责让系统能听懂请求、处理文字证据、出错后补救；安全约束由代码保证，而不是依赖大模型的判断。</w:t>
+      </w:r>
+    </w:p>
+    <w:p>
+      <w:pPr>
         <w:pStyle w:val="Heading1"/>
       </w:pPr>
       <w:r>
@@ -1574,7 +2644,7 @@
     </w:p>
     <w:p>
       <w:r>
-        <w:t>湿实验需要实体化合物、细胞模型和仪器，目前不具备执行条件，故剂量、LUAD 亚型、NR3C1 依赖和联合用药仅保留为预设方案。五个疾病分区仍来自 TRANSCRIPT，不是外部独立数据集；正例/未知修订实验给出了负结果。外部数据可行性审计已取得 233 个 CREEDS 疾病签名、6,100 个 CMap 实验的原始秩矩阵，并对齐 Open Targets 和 repoDB，但前者没有明确负标签；repoDB 的严格跨库匹配只有 14 个疾病同时有正负记录，零个疾病满足保守的逐疾病五折门槛。排除与 TRANSCRIPT 相同的 CUI 后只剩两个疾病同时有正负记录；使用 Open Targets UMLS 交叉引用扩展匹配仍没有合格单元。因此独立方法选择 v3 没有运行，也没有外部 NS-AUC 结论。下一步需要新的来源不重叠的表达与关联数据、外层训练集内的性能证据与预先冻结的比较协议；已有分区不能再次充当确认集。Jev 若获得访问权限也需另做真实评测。课程答辩应展示已完成结果与这些边界，不将计划写成已验证结论。</w:t>
+        <w:t>湿实验需要实体化合物、细胞模型和仪器，目前不具备执行条件，故剂量、LUAD 亚型、NR3C1 依赖和联合用药仅保留为预设方案。五个疾病分区仍来自 TRANSCRIPT，不是外部独立数据集；正例/未知修订实验给出了负结果。外部数据可行性审计已取得 233 个 CREEDS 疾病签名、6,100 个 CMap 实验的原始秩矩阵，并对齐 Open Targets 和 repoDB，但前者没有明确负标签；repoDB 的严格跨库匹配只有 14 个疾病同时有正负记录，零个疾病满足保守的逐疾病五折门槛。排除与 TRANSCRIPT 相同的 CUI 后只剩两个疾病同时有正负记录；使用 Open Targets UMLS 交叉引用扩展匹配仍没有合格单元。因此独立方法选择 v3 没有运行，也没有外部 NS-AUC 结论。下一步需要新的来源不重叠的表达与关联数据、外层训练集内的性能证据与预先冻结的比较协议；已有分区不能再次充当确认集。Jev 目前只测了免费版 jev-1.13-free、每组用例单次运行，付费版与重复运行尚未评测。课程答辩应展示已完成结果与这些边界，不将计划写成已验证结论。</w:t>
       </w:r>
     </w:p>
     <w:p>

</xml_diff>

<commit_message>
deliverables: rebuild deck v7 and report v5 with the capability boundary
Report section 5.3 (registered diseases, GEO download, breast-cancer
feasibility), the 10-tool architecture figure, and the slide 12 limitations
row. Word 12 pages, LaTeX 11 pages; 12 slides rendered and inspected; LaTeX
QA, deliverable check and 169 tests pass.

Co-Authored-By: Claude Opus 5.5 <noreply@anthropic.com>
</commit_message>
<xml_diff>
--- a/deliverables/药物重定位Agent_课程设计报告_v5.docx
+++ b/deliverables/药物重定位Agent_课程设计报告_v5.docx
@@ -2631,6 +2631,37 @@
     </w:p>
     <w:p>
       <w:pPr>
+        <w:pStyle w:val="Heading2"/>
+      </w:pPr>
+      <w:r>
+        <w:t>能力边界：登记疾病与自动下载</w:t>
+      </w:r>
+    </w:p>
+    <w:p>
+      <w:r>
+        <w:t>Agent 只分析疾病登记表（</w:t>
+      </w:r>
+      <w:r>
+        <w:t>configs/disease_registry_v1.json</w:t>
+      </w:r>
+      <w:r>
+        <w:t xml:space="preserve">）中的疾病，目前只有肺腺癌（GSE32863，药物端为 A549）。每个条目固定 GEO 文件的 URL 与 SHA-256、样本配对规则、预期样本数和药物细胞系。疾病由代码按登记别名识别，不做猜测；未登记的疾病会转人工。请求中点名了登记疾病时，规划器可以调用 </w:t>
+      </w:r>
+      <w:r>
+        <w:t>fetch_geo_series</w:t>
+      </w:r>
+      <w:r>
+        <w:t xml:space="preserve"> 从 NCBI 下载数据并核验哈希；质控和差异表达始终从原始 series matrix 重算，不读缓存。在原始文件被移走的情况下，规则和 DeepSeek 规划器都自动完成了“下载 → 质控 → 差异表达 → 排名 → 审计 → 文献 → 报告”，签名与冻结结果逐字节一致（512/749），全程约 28 秒；请求乳腺癌时则转人工并说明原因。冻结 40 例在新版本上重跑，规则规划器仍为 30/40，DeepSeek 为 38/40（原 36/40，差异属于逐次运行波动）。用同一套代码对乳腺癌 GSE15852 + MCF7 试跑，43 对样本全部配对，得到 115 个上调、193 个下调，排名 6,231 个化合物，说明扩展到第二个疾病技术上可行；但文献审阅目前只支持肺腺癌，乳腺癌也没有预设参考药，因此没有加入登记表，也不作为结果报告（</w:t>
+      </w:r>
+      <w:r>
+        <w:t>docs/agent_v2.md</w:t>
+      </w:r>
+      <w:r>
+        <w:t>）。</w:t>
+      </w:r>
+    </w:p>
+    <w:p>
+      <w:pPr>
         <w:pStyle w:val="Heading1"/>
       </w:pPr>
       <w:r>
@@ -2639,7 +2670,7 @@
     </w:p>
     <w:p>
       <w:r>
-        <w:t>本项目的表达反转指标在公开基准上没有取得领先结果，提示基于转录组的单一对抗方向不足以代表药物与疾病的真实治疗关系。LUAD 案例只有单一 A549 细胞系、固定剂量与时间；逐签名 ID 已恢复，但交叉来源的盐型、立体化学和同义词问题仍需实物核验。前十名的类固醇集中也可能反映共同转录反应。候选级文献矩阵已记录支持与反对信号，但它是有边界的人工分诊而非系统综述，且类别证据不能替代候选药特异验证。没有足够证据把任何候选推荐给患者。</w:t>
+        <w:t>本项目的表达反转指标在公开基准上没有取得领先结果，提示基于转录组的单一对抗方向不足以代表药物与疾病的真实治疗关系。LUAD 案例只有单一 A549 细胞系、固定剂量与时间；逐签名 ID 已恢复，但交叉来源的盐型、立体化学和同义词问题仍需实物核验。前十名的类固醇集中也可能反映共同转录反应。候选级文献矩阵已记录支持与反对信号，但它是有边界的人工分诊而非系统综述，且类别证据不能替代候选药特异验证。没有足够证据把任何候选推荐给患者。Agent 只能分析登记过的疾病（目前只有肺腺癌），不能为任意疾病自动挑选 GEO 数据集；文献审阅的检索式也只针对肺腺癌。</w:t>
       </w:r>
     </w:p>
     <w:p>

</xml_diff>

<commit_message>
deliverables: rebuild deck v7 and report v5 with breast cancer registered
Word 12 pages, LaTeX 12 pages (agent_v2 5 pages); 12 slides rendered; LaTeX
QA, deliverable check and tests pass.

Co-Authored-By: Claude Opus 5.5 <noreply@anthropic.com>
</commit_message>
<xml_diff>
--- a/deliverables/药物重定位Agent_课程设计报告_v5.docx
+++ b/deliverables/药物重定位Agent_课程设计报告_v5.docx
@@ -2634,7 +2634,7 @@
         <w:pStyle w:val="Heading2"/>
       </w:pPr>
       <w:r>
-        <w:t>能力边界：登记疾病与自动下载</w:t>
+        <w:t>能力边界：登记疾病、自动下载与第二个疾病</w:t>
       </w:r>
     </w:p>
     <w:p>
@@ -2645,13 +2645,13 @@
         <w:t>configs/disease_registry_v1.json</w:t>
       </w:r>
       <w:r>
-        <w:t xml:space="preserve">）中的疾病，目前只有肺腺癌（GSE32863，药物端为 A549）。每个条目固定 GEO 文件的 URL 与 SHA-256、样本配对规则、预期样本数和药物细胞系。疾病由代码按登记别名识别，不做猜测；未登记的疾病会转人工。请求中点名了登记疾病时，规划器可以调用 </w:t>
+        <w:t xml:space="preserve">）中的疾病，目前有肺腺癌（GSE32863，药物端为 A549）和乳腺癌（GSE15852，43 对，药物端为 MCF7）。每个条目固定 GEO 文件的 URL 与 SHA-256、样本配对规则、预期样本数、药物细胞系和文献审阅配置。疾病由代码按登记别名识别，不做猜测；未登记的疾病会转人工。请求中点名了登记疾病时，规划器可以调用 </w:t>
       </w:r>
       <w:r>
         <w:t>fetch_geo_series</w:t>
       </w:r>
       <w:r>
-        <w:t xml:space="preserve"> 从 NCBI 下载数据并核验哈希；质控和差异表达始终从原始 series matrix 重算，不读缓存。在原始文件被移走的情况下，规则和 DeepSeek 规划器都自动完成了“下载 → 质控 → 差异表达 → 排名 → 审计 → 文献 → 报告”，签名与冻结结果逐字节一致（512/749），全程约 28 秒；请求乳腺癌时则转人工并说明原因。冻结 40 例在新版本上重跑，规则规划器仍为 30/40，DeepSeek 为 38/40（原 36/40，差异属于逐次运行波动）。用同一套代码对乳腺癌 GSE15852 + MCF7 试跑，43 对样本全部配对，得到 115 个上调、193 个下调，排名 6,231 个化合物，说明扩展到第二个疾病技术上可行；但文献审阅目前只支持肺腺癌，乳腺癌也没有预设参考药，因此没有加入登记表，也不作为结果报告（</w:t>
+        <w:t xml:space="preserve"> 从 NCBI 下载数据并核验哈希；质控和差异表达始终从原始 series matrix 重算，不读缓存。肺腺癌原始文件被移走后，规则和 DeepSeek 规划器都自动完成了“下载 → 质控 → 差异表达 → 排名 → 审计 → 文献 → 报告”，签名与冻结结果逐字节一致（512/749），全程约 28 秒。乳腺癌同样从零开始跑通：参考药清单在计算名次之前提交，16/20 可测，平均名次百分位 0.363，置换 p = 0.029，比随机靠前，但多半反映抗增殖药反转增殖签名，并非疾病特异，且只运行一次。文献审阅改为可配置：肺腺癌沿用冻结审阅的原始提示词，乳腺癌使用中性模板并实时运行；第一次因 PubMed 连接超时失败后，规划器只重新规划了“文献 → 报告”，第二次 21 次调用完成，62 条引语中 23 条被逐字校验拒绝，分级未经人工复核。未登记的胃癌最终转人工，但途中多跑了一个无关的基准排名。冻结 40 例在新版本上重跑，规则规划器仍为 30/40，DeepSeek 为 38/40（原 36/40，差异属于逐次运行波动）（</w:t>
       </w:r>
       <w:r>
         <w:t>docs/agent_v2.md</w:t>
@@ -2670,7 +2670,7 @@
     </w:p>
     <w:p>
       <w:r>
-        <w:t>本项目的表达反转指标在公开基准上没有取得领先结果，提示基于转录组的单一对抗方向不足以代表药物与疾病的真实治疗关系。LUAD 案例只有单一 A549 细胞系、固定剂量与时间；逐签名 ID 已恢复，但交叉来源的盐型、立体化学和同义词问题仍需实物核验。前十名的类固醇集中也可能反映共同转录反应。候选级文献矩阵已记录支持与反对信号，但它是有边界的人工分诊而非系统综述，且类别证据不能替代候选药特异验证。没有足够证据把任何候选推荐给患者。Agent 只能分析登记过的疾病（目前只有肺腺癌），不能为任意疾病自动挑选 GEO 数据集；文献审阅的检索式也只针对肺腺癌。</w:t>
+        <w:t>本项目的表达反转指标在公开基准上没有取得领先结果，提示基于转录组的单一对抗方向不足以代表药物与疾病的真实治疗关系。LUAD 案例只有单一 A549 细胞系、固定剂量与时间；逐签名 ID 已恢复，但交叉来源的盐型、立体化学和同义词问题仍需实物核验。前十名的类固醇集中也可能反映共同转录反应。候选级文献矩阵已记录支持与反对信号，但它是有边界的人工分诊而非系统综述，且类别证据不能替代候选药特异验证。没有足够证据把任何候选推荐给患者。Agent 只能分析登记过的疾病（目前是肺腺癌和乳腺癌），不能为任意疾病自动挑选 GEO 数据集；乳腺癌没有冻结的文献审阅和候选身份审计，药物端 MCF7 也只代表雌激素受体阳性亚型。</w:t>
       </w:r>
     </w:p>
     <w:p>

</xml_diff>

<commit_message>
deliverables: rebuild deck v7 and report v5 with five registered diseases
Word 13 pages, LaTeX 12 pages (agent_v2 6 pages); 12 slides rendered; LaTeX
QA, deliverable check and tests pass.

Co-Authored-By: Claude Opus 5.5 <noreply@anthropic.com>
</commit_message>
<xml_diff>
--- a/deliverables/药物重定位Agent_课程设计报告_v5.docx
+++ b/deliverables/药物重定位Agent_课程设计报告_v5.docx
@@ -2645,13 +2645,1131 @@
         <w:t>configs/disease_registry_v1.json</w:t>
       </w:r>
       <w:r>
-        <w:t xml:space="preserve">）中的疾病，目前有肺腺癌（GSE32863，药物端为 A549）和乳腺癌（GSE15852，43 对，药物端为 MCF7）。每个条目固定 GEO 文件的 URL 与 SHA-256、样本配对规则、预期样本数、药物细胞系和文献审阅配置。疾病由代码按登记别名识别，不做猜测；未登记的疾病会转人工。请求中点名了登记疾病时，规划器可以调用 </w:t>
+        <w:t xml:space="preserve">）中的疾病，目前预先登记了 5 个：肺腺癌、乳腺癌、结直肠癌、前列腺癌和黑色素瘤。登记时完成下载之前的所有工作：只读 GEO 文件头确定分组规则与样本数，流式计算并固定文件的 SHA-256（不保存数据），选定药物细胞系和文献检索式，并在计算任何名次之前提交参考药清单。Agent 只在请求需要时调用 </w:t>
       </w:r>
       <w:r>
         <w:t>fetch_geo_series</w:t>
       </w:r>
       <w:r>
-        <w:t xml:space="preserve"> 从 NCBI 下载数据并核验哈希；质控和差异表达始终从原始 series matrix 重算，不读缓存。肺腺癌原始文件被移走后，规则和 DeepSeek 规划器都自动完成了“下载 → 质控 → 差异表达 → 排名 → 审计 → 文献 → 报告”，签名与冻结结果逐字节一致（512/749），全程约 28 秒。乳腺癌同样从零开始跑通：参考药清单在计算名次之前提交，16/20 可测，平均名次百分位 0.363，置换 p = 0.029，比随机靠前，但多半反映抗增殖药反转增殖签名，并非疾病特异，且只运行一次。文献审阅改为可配置：肺腺癌沿用冻结审阅的原始提示词，乳腺癌使用中性模板并实时运行；第一次因 PubMed 连接超时失败后，规划器只重新规划了“文献 → 报告”，第二次 21 次调用完成，62 条引语中 23 条被逐字校验拒绝，分级未经人工复核。未登记的胃癌最终转人工，但途中多跑了一个无关的基准排名。冻结 40 例在新版本上重跑，规则规划器仍为 30/40，DeepSeek 为 38/40（原 36/40，差异属于逐次运行波动）（</w:t>
+        <w:t xml:space="preserve"> 下载并核验哈希，质控和差异表达始终从原始 series matrix 重算；未登记的疾病会转人工。可登记的疾病数受药物端限制：只有少数肿瘤细胞系有上千个化合物签名，肝癌因细胞系化合物太少未登记。为支持没有配对样本的数据集，新增了不配对的两组比较（Welch t 检验）。</w:t>
+      </w:r>
+    </w:p>
+    <w:tbl>
+      <w:tblPr>
+        <w:tblW w:type="auto" w:w="0"/>
+        <w:tblLayout w:type="fixed"/>
+        <w:tblLook w:firstColumn="1" w:firstRow="1" w:lastColumn="0" w:lastRow="0" w:noHBand="0" w:noVBand="1" w:val="04A0"/>
+      </w:tblPr>
+      <w:tblGrid>
+        <w:gridCol w:w="1999"/>
+        <w:gridCol w:w="1999"/>
+        <w:gridCol w:w="1999"/>
+        <w:gridCol w:w="1999"/>
+        <w:gridCol w:w="1999"/>
+      </w:tblGrid>
+      <w:tr>
+        <w:trPr>
+          <w:tblHeader w:val="true"/>
+        </w:trPr>
+        <w:tc>
+          <w:tcPr>
+            <w:tcW w:type="dxa" w:w="1973"/>
+            <w:vAlign w:val="center"/>
+            <w:shd w:fill="18384E"/>
+            <w:tcBorders>
+              <w:top w:val="single" w:sz="4" w:color="D9D9D9"/>
+              <w:left w:val="single" w:sz="4" w:color="D9D9D9"/>
+              <w:bottom w:val="single" w:sz="4" w:color="D9D9D9"/>
+              <w:right w:val="single" w:sz="4" w:color="D9D9D9"/>
+            </w:tcBorders>
+            <w:tcMar>
+              <w:top w:w="75" w:type="dxa"/>
+              <w:left w:w="75" w:type="dxa"/>
+              <w:bottom w:w="75" w:type="dxa"/>
+              <w:right w:w="75" w:type="dxa"/>
+            </w:tcMar>
+          </w:tcPr>
+          <w:p>
+            <w:pPr>
+              <w:spacing w:after="0"/>
+            </w:pPr>
+            <w:r>
+              <w:rPr>
+                <w:b/>
+                <w:color w:val="FFFFFF"/>
+                <w:sz w:val="17"/>
+              </w:rPr>
+            </w:r>
+            <w:r>
+              <w:rPr>
+                <w:b/>
+                <w:color w:val="FFFFFF"/>
+                <w:sz w:val="17"/>
+              </w:rPr>
+              <w:t>疾病</w:t>
+            </w:r>
+          </w:p>
+        </w:tc>
+        <w:tc>
+          <w:tcPr>
+            <w:tcW w:type="dxa" w:w="1973"/>
+            <w:vAlign w:val="center"/>
+            <w:shd w:fill="18384E"/>
+            <w:tcBorders>
+              <w:top w:val="single" w:sz="4" w:color="D9D9D9"/>
+              <w:left w:val="single" w:sz="4" w:color="D9D9D9"/>
+              <w:bottom w:val="single" w:sz="4" w:color="D9D9D9"/>
+              <w:right w:val="single" w:sz="4" w:color="D9D9D9"/>
+            </w:tcBorders>
+            <w:tcMar>
+              <w:top w:w="75" w:type="dxa"/>
+              <w:left w:w="75" w:type="dxa"/>
+              <w:bottom w:w="75" w:type="dxa"/>
+              <w:right w:w="75" w:type="dxa"/>
+            </w:tcMar>
+          </w:tcPr>
+          <w:p>
+            <w:pPr>
+              <w:spacing w:after="0"/>
+              <w:jc w:val="center"/>
+            </w:pPr>
+            <w:r>
+              <w:rPr>
+                <w:b/>
+                <w:color w:val="FFFFFF"/>
+                <w:sz w:val="17"/>
+              </w:rPr>
+            </w:r>
+            <w:r>
+              <w:rPr>
+                <w:b/>
+                <w:color w:val="FFFFFF"/>
+                <w:sz w:val="17"/>
+              </w:rPr>
+              <w:t>GEO / 设计</w:t>
+            </w:r>
+          </w:p>
+        </w:tc>
+        <w:tc>
+          <w:tcPr>
+            <w:tcW w:type="dxa" w:w="1973"/>
+            <w:vAlign w:val="center"/>
+            <w:shd w:fill="18384E"/>
+            <w:tcBorders>
+              <w:top w:val="single" w:sz="4" w:color="D9D9D9"/>
+              <w:left w:val="single" w:sz="4" w:color="D9D9D9"/>
+              <w:bottom w:val="single" w:sz="4" w:color="D9D9D9"/>
+              <w:right w:val="single" w:sz="4" w:color="D9D9D9"/>
+            </w:tcBorders>
+            <w:tcMar>
+              <w:top w:w="75" w:type="dxa"/>
+              <w:left w:w="75" w:type="dxa"/>
+              <w:bottom w:w="75" w:type="dxa"/>
+              <w:right w:w="75" w:type="dxa"/>
+            </w:tcMar>
+          </w:tcPr>
+          <w:p>
+            <w:pPr>
+              <w:spacing w:after="0"/>
+              <w:jc w:val="center"/>
+            </w:pPr>
+            <w:r>
+              <w:rPr>
+                <w:b/>
+                <w:color w:val="FFFFFF"/>
+                <w:sz w:val="17"/>
+              </w:rPr>
+            </w:r>
+            <w:r>
+              <w:rPr>
+                <w:b/>
+                <w:color w:val="FFFFFF"/>
+                <w:sz w:val="17"/>
+              </w:rPr>
+              <w:t>药物细胞系</w:t>
+            </w:r>
+          </w:p>
+        </w:tc>
+        <w:tc>
+          <w:tcPr>
+            <w:tcW w:type="dxa" w:w="1973"/>
+            <w:vAlign w:val="center"/>
+            <w:shd w:fill="18384E"/>
+            <w:tcBorders>
+              <w:top w:val="single" w:sz="4" w:color="D9D9D9"/>
+              <w:left w:val="single" w:sz="4" w:color="D9D9D9"/>
+              <w:bottom w:val="single" w:sz="4" w:color="D9D9D9"/>
+              <w:right w:val="single" w:sz="4" w:color="D9D9D9"/>
+            </w:tcBorders>
+            <w:tcMar>
+              <w:top w:w="75" w:type="dxa"/>
+              <w:left w:w="75" w:type="dxa"/>
+              <w:bottom w:w="75" w:type="dxa"/>
+              <w:right w:w="75" w:type="dxa"/>
+            </w:tcMar>
+          </w:tcPr>
+          <w:p>
+            <w:pPr>
+              <w:spacing w:after="0"/>
+              <w:jc w:val="center"/>
+            </w:pPr>
+            <w:r>
+              <w:rPr>
+                <w:b/>
+                <w:color w:val="FFFFFF"/>
+                <w:sz w:val="17"/>
+              </w:rPr>
+            </w:r>
+            <w:r>
+              <w:rPr>
+                <w:b/>
+                <w:color w:val="FFFFFF"/>
+                <w:sz w:val="17"/>
+              </w:rPr>
+              <w:t>签名（上调/下调）</w:t>
+            </w:r>
+          </w:p>
+        </w:tc>
+        <w:tc>
+          <w:tcPr>
+            <w:tcW w:type="dxa" w:w="1973"/>
+            <w:vAlign w:val="center"/>
+            <w:shd w:fill="18384E"/>
+            <w:tcBorders>
+              <w:top w:val="single" w:sz="4" w:color="D9D9D9"/>
+              <w:left w:val="single" w:sz="4" w:color="D9D9D9"/>
+              <w:bottom w:val="single" w:sz="4" w:color="D9D9D9"/>
+              <w:right w:val="single" w:sz="4" w:color="D9D9D9"/>
+            </w:tcBorders>
+            <w:tcMar>
+              <w:top w:w="75" w:type="dxa"/>
+              <w:left w:w="75" w:type="dxa"/>
+              <w:bottom w:w="75" w:type="dxa"/>
+              <w:right w:w="75" w:type="dxa"/>
+            </w:tcMar>
+          </w:tcPr>
+          <w:p>
+            <w:pPr>
+              <w:spacing w:after="0"/>
+              <w:jc w:val="center"/>
+            </w:pPr>
+            <w:r>
+              <w:rPr>
+                <w:b/>
+                <w:color w:val="FFFFFF"/>
+                <w:sz w:val="17"/>
+              </w:rPr>
+            </w:r>
+            <w:r>
+              <w:rPr>
+                <w:b/>
+                <w:color w:val="FFFFFF"/>
+                <w:sz w:val="17"/>
+              </w:rPr>
+              <w:t>参考药恢复</w:t>
+            </w:r>
+          </w:p>
+        </w:tc>
+      </w:tr>
+      <w:tr>
+        <w:tc>
+          <w:tcPr>
+            <w:tcW w:type="dxa" w:w="1973"/>
+            <w:vAlign w:val="center"/>
+            <w:tcBorders>
+              <w:top w:val="single" w:sz="4" w:color="D9D9D9"/>
+              <w:left w:val="single" w:sz="4" w:color="D9D9D9"/>
+              <w:bottom w:val="single" w:sz="4" w:color="D9D9D9"/>
+              <w:right w:val="single" w:sz="4" w:color="D9D9D9"/>
+            </w:tcBorders>
+            <w:tcMar>
+              <w:top w:w="75" w:type="dxa"/>
+              <w:left w:w="75" w:type="dxa"/>
+              <w:bottom w:w="75" w:type="dxa"/>
+              <w:right w:w="75" w:type="dxa"/>
+            </w:tcMar>
+          </w:tcPr>
+          <w:p>
+            <w:pPr>
+              <w:spacing w:after="0"/>
+            </w:pPr>
+            <w:r>
+              <w:rPr>
+                <w:sz w:val="17"/>
+              </w:rPr>
+            </w:r>
+            <w:r>
+              <w:rPr>
+                <w:sz w:val="17"/>
+              </w:rPr>
+              <w:t>肺腺癌</w:t>
+            </w:r>
+          </w:p>
+        </w:tc>
+        <w:tc>
+          <w:tcPr>
+            <w:tcW w:type="dxa" w:w="1973"/>
+            <w:vAlign w:val="center"/>
+            <w:tcBorders>
+              <w:top w:val="single" w:sz="4" w:color="D9D9D9"/>
+              <w:left w:val="single" w:sz="4" w:color="D9D9D9"/>
+              <w:bottom w:val="single" w:sz="4" w:color="D9D9D9"/>
+              <w:right w:val="single" w:sz="4" w:color="D9D9D9"/>
+            </w:tcBorders>
+            <w:tcMar>
+              <w:top w:w="75" w:type="dxa"/>
+              <w:left w:w="75" w:type="dxa"/>
+              <w:bottom w:w="75" w:type="dxa"/>
+              <w:right w:w="75" w:type="dxa"/>
+            </w:tcMar>
+          </w:tcPr>
+          <w:p>
+            <w:pPr>
+              <w:spacing w:after="0"/>
+              <w:jc w:val="center"/>
+            </w:pPr>
+            <w:r>
+              <w:rPr>
+                <w:sz w:val="17"/>
+              </w:rPr>
+            </w:r>
+            <w:r>
+              <w:rPr>
+                <w:sz w:val="17"/>
+              </w:rPr>
+              <w:t>GSE32863 / 配对 57 对</w:t>
+            </w:r>
+          </w:p>
+        </w:tc>
+        <w:tc>
+          <w:tcPr>
+            <w:tcW w:type="dxa" w:w="1973"/>
+            <w:vAlign w:val="center"/>
+            <w:tcBorders>
+              <w:top w:val="single" w:sz="4" w:color="D9D9D9"/>
+              <w:left w:val="single" w:sz="4" w:color="D9D9D9"/>
+              <w:bottom w:val="single" w:sz="4" w:color="D9D9D9"/>
+              <w:right w:val="single" w:sz="4" w:color="D9D9D9"/>
+            </w:tcBorders>
+            <w:tcMar>
+              <w:top w:w="75" w:type="dxa"/>
+              <w:left w:w="75" w:type="dxa"/>
+              <w:bottom w:w="75" w:type="dxa"/>
+              <w:right w:w="75" w:type="dxa"/>
+            </w:tcMar>
+          </w:tcPr>
+          <w:p>
+            <w:pPr>
+              <w:spacing w:after="0"/>
+              <w:jc w:val="center"/>
+            </w:pPr>
+            <w:r>
+              <w:rPr>
+                <w:sz w:val="17"/>
+              </w:rPr>
+            </w:r>
+            <w:r>
+              <w:rPr>
+                <w:sz w:val="17"/>
+              </w:rPr>
+              <w:t>A549</w:t>
+            </w:r>
+          </w:p>
+        </w:tc>
+        <w:tc>
+          <w:tcPr>
+            <w:tcW w:type="dxa" w:w="1973"/>
+            <w:vAlign w:val="center"/>
+            <w:tcBorders>
+              <w:top w:val="single" w:sz="4" w:color="D9D9D9"/>
+              <w:left w:val="single" w:sz="4" w:color="D9D9D9"/>
+              <w:bottom w:val="single" w:sz="4" w:color="D9D9D9"/>
+              <w:right w:val="single" w:sz="4" w:color="D9D9D9"/>
+            </w:tcBorders>
+            <w:tcMar>
+              <w:top w:w="75" w:type="dxa"/>
+              <w:left w:w="75" w:type="dxa"/>
+              <w:bottom w:w="75" w:type="dxa"/>
+              <w:right w:w="75" w:type="dxa"/>
+            </w:tcMar>
+          </w:tcPr>
+          <w:p>
+            <w:pPr>
+              <w:spacing w:after="0"/>
+              <w:jc w:val="center"/>
+            </w:pPr>
+            <w:r>
+              <w:rPr>
+                <w:sz w:val="17"/>
+              </w:rPr>
+            </w:r>
+            <w:r>
+              <w:rPr>
+                <w:sz w:val="17"/>
+              </w:rPr>
+              <w:t>512 / 749</w:t>
+            </w:r>
+          </w:p>
+        </w:tc>
+        <w:tc>
+          <w:tcPr>
+            <w:tcW w:type="dxa" w:w="1973"/>
+            <w:vAlign w:val="center"/>
+            <w:tcBorders>
+              <w:top w:val="single" w:sz="4" w:color="D9D9D9"/>
+              <w:left w:val="single" w:sz="4" w:color="D9D9D9"/>
+              <w:bottom w:val="single" w:sz="4" w:color="D9D9D9"/>
+              <w:right w:val="single" w:sz="4" w:color="D9D9D9"/>
+            </w:tcBorders>
+            <w:tcMar>
+              <w:top w:w="75" w:type="dxa"/>
+              <w:left w:w="75" w:type="dxa"/>
+              <w:bottom w:w="75" w:type="dxa"/>
+              <w:right w:w="75" w:type="dxa"/>
+            </w:tcMar>
+          </w:tcPr>
+          <w:p>
+            <w:pPr>
+              <w:spacing w:after="0"/>
+              <w:jc w:val="center"/>
+            </w:pPr>
+            <w:r>
+              <w:rPr>
+                <w:sz w:val="17"/>
+              </w:rPr>
+            </w:r>
+            <w:r>
+              <w:rPr>
+                <w:sz w:val="17"/>
+              </w:rPr>
+              <w:t>5/11 可测，百分位 0.362，p = 0.145</w:t>
+            </w:r>
+          </w:p>
+        </w:tc>
+      </w:tr>
+      <w:tr>
+        <w:tc>
+          <w:tcPr>
+            <w:tcW w:type="dxa" w:w="1973"/>
+            <w:vAlign w:val="center"/>
+            <w:shd w:fill="F2F6F8"/>
+            <w:tcBorders>
+              <w:top w:val="single" w:sz="4" w:color="D9D9D9"/>
+              <w:left w:val="single" w:sz="4" w:color="D9D9D9"/>
+              <w:bottom w:val="single" w:sz="4" w:color="D9D9D9"/>
+              <w:right w:val="single" w:sz="4" w:color="D9D9D9"/>
+            </w:tcBorders>
+            <w:tcMar>
+              <w:top w:w="75" w:type="dxa"/>
+              <w:left w:w="75" w:type="dxa"/>
+              <w:bottom w:w="75" w:type="dxa"/>
+              <w:right w:w="75" w:type="dxa"/>
+            </w:tcMar>
+          </w:tcPr>
+          <w:p>
+            <w:pPr>
+              <w:spacing w:after="0"/>
+            </w:pPr>
+            <w:r>
+              <w:rPr>
+                <w:sz w:val="17"/>
+              </w:rPr>
+            </w:r>
+            <w:r>
+              <w:rPr>
+                <w:sz w:val="17"/>
+              </w:rPr>
+              <w:t>乳腺癌</w:t>
+            </w:r>
+          </w:p>
+        </w:tc>
+        <w:tc>
+          <w:tcPr>
+            <w:tcW w:type="dxa" w:w="1973"/>
+            <w:vAlign w:val="center"/>
+            <w:shd w:fill="F2F6F8"/>
+            <w:tcBorders>
+              <w:top w:val="single" w:sz="4" w:color="D9D9D9"/>
+              <w:left w:val="single" w:sz="4" w:color="D9D9D9"/>
+              <w:bottom w:val="single" w:sz="4" w:color="D9D9D9"/>
+              <w:right w:val="single" w:sz="4" w:color="D9D9D9"/>
+            </w:tcBorders>
+            <w:tcMar>
+              <w:top w:w="75" w:type="dxa"/>
+              <w:left w:w="75" w:type="dxa"/>
+              <w:bottom w:w="75" w:type="dxa"/>
+              <w:right w:w="75" w:type="dxa"/>
+            </w:tcMar>
+          </w:tcPr>
+          <w:p>
+            <w:pPr>
+              <w:spacing w:after="0"/>
+              <w:jc w:val="center"/>
+            </w:pPr>
+            <w:r>
+              <w:rPr>
+                <w:sz w:val="17"/>
+              </w:rPr>
+            </w:r>
+            <w:r>
+              <w:rPr>
+                <w:sz w:val="17"/>
+              </w:rPr>
+              <w:t>GSE15852 / 配对 43 对</w:t>
+            </w:r>
+          </w:p>
+        </w:tc>
+        <w:tc>
+          <w:tcPr>
+            <w:tcW w:type="dxa" w:w="1973"/>
+            <w:vAlign w:val="center"/>
+            <w:shd w:fill="F2F6F8"/>
+            <w:tcBorders>
+              <w:top w:val="single" w:sz="4" w:color="D9D9D9"/>
+              <w:left w:val="single" w:sz="4" w:color="D9D9D9"/>
+              <w:bottom w:val="single" w:sz="4" w:color="D9D9D9"/>
+              <w:right w:val="single" w:sz="4" w:color="D9D9D9"/>
+            </w:tcBorders>
+            <w:tcMar>
+              <w:top w:w="75" w:type="dxa"/>
+              <w:left w:w="75" w:type="dxa"/>
+              <w:bottom w:w="75" w:type="dxa"/>
+              <w:right w:w="75" w:type="dxa"/>
+            </w:tcMar>
+          </w:tcPr>
+          <w:p>
+            <w:pPr>
+              <w:spacing w:after="0"/>
+              <w:jc w:val="center"/>
+            </w:pPr>
+            <w:r>
+              <w:rPr>
+                <w:sz w:val="17"/>
+              </w:rPr>
+            </w:r>
+            <w:r>
+              <w:rPr>
+                <w:sz w:val="17"/>
+              </w:rPr>
+              <w:t>MCF7</w:t>
+            </w:r>
+          </w:p>
+        </w:tc>
+        <w:tc>
+          <w:tcPr>
+            <w:tcW w:type="dxa" w:w="1973"/>
+            <w:vAlign w:val="center"/>
+            <w:shd w:fill="F2F6F8"/>
+            <w:tcBorders>
+              <w:top w:val="single" w:sz="4" w:color="D9D9D9"/>
+              <w:left w:val="single" w:sz="4" w:color="D9D9D9"/>
+              <w:bottom w:val="single" w:sz="4" w:color="D9D9D9"/>
+              <w:right w:val="single" w:sz="4" w:color="D9D9D9"/>
+            </w:tcBorders>
+            <w:tcMar>
+              <w:top w:w="75" w:type="dxa"/>
+              <w:left w:w="75" w:type="dxa"/>
+              <w:bottom w:w="75" w:type="dxa"/>
+              <w:right w:w="75" w:type="dxa"/>
+            </w:tcMar>
+          </w:tcPr>
+          <w:p>
+            <w:pPr>
+              <w:spacing w:after="0"/>
+              <w:jc w:val="center"/>
+            </w:pPr>
+            <w:r>
+              <w:rPr>
+                <w:sz w:val="17"/>
+              </w:rPr>
+            </w:r>
+            <w:r>
+              <w:rPr>
+                <w:sz w:val="17"/>
+              </w:rPr>
+              <w:t>115 / 193</w:t>
+            </w:r>
+          </w:p>
+        </w:tc>
+        <w:tc>
+          <w:tcPr>
+            <w:tcW w:type="dxa" w:w="1973"/>
+            <w:vAlign w:val="center"/>
+            <w:shd w:fill="F2F6F8"/>
+            <w:tcBorders>
+              <w:top w:val="single" w:sz="4" w:color="D9D9D9"/>
+              <w:left w:val="single" w:sz="4" w:color="D9D9D9"/>
+              <w:bottom w:val="single" w:sz="4" w:color="D9D9D9"/>
+              <w:right w:val="single" w:sz="4" w:color="D9D9D9"/>
+            </w:tcBorders>
+            <w:tcMar>
+              <w:top w:w="75" w:type="dxa"/>
+              <w:left w:w="75" w:type="dxa"/>
+              <w:bottom w:w="75" w:type="dxa"/>
+              <w:right w:w="75" w:type="dxa"/>
+            </w:tcMar>
+          </w:tcPr>
+          <w:p>
+            <w:pPr>
+              <w:spacing w:after="0"/>
+              <w:jc w:val="center"/>
+            </w:pPr>
+            <w:r>
+              <w:rPr>
+                <w:sz w:val="17"/>
+              </w:rPr>
+            </w:r>
+            <w:r>
+              <w:rPr>
+                <w:sz w:val="17"/>
+              </w:rPr>
+              <w:t>16/20 可测，百分位 0.363，p = 0.029</w:t>
+            </w:r>
+          </w:p>
+        </w:tc>
+      </w:tr>
+      <w:tr>
+        <w:tc>
+          <w:tcPr>
+            <w:tcW w:type="dxa" w:w="1973"/>
+            <w:vAlign w:val="center"/>
+            <w:tcBorders>
+              <w:top w:val="single" w:sz="4" w:color="D9D9D9"/>
+              <w:left w:val="single" w:sz="4" w:color="D9D9D9"/>
+              <w:bottom w:val="single" w:sz="4" w:color="D9D9D9"/>
+              <w:right w:val="single" w:sz="4" w:color="D9D9D9"/>
+            </w:tcBorders>
+            <w:tcMar>
+              <w:top w:w="75" w:type="dxa"/>
+              <w:left w:w="75" w:type="dxa"/>
+              <w:bottom w:w="75" w:type="dxa"/>
+              <w:right w:w="75" w:type="dxa"/>
+            </w:tcMar>
+          </w:tcPr>
+          <w:p>
+            <w:pPr>
+              <w:spacing w:after="0"/>
+            </w:pPr>
+            <w:r>
+              <w:rPr>
+                <w:sz w:val="17"/>
+              </w:rPr>
+            </w:r>
+            <w:r>
+              <w:rPr>
+                <w:sz w:val="17"/>
+              </w:rPr>
+              <w:t>结直肠癌</w:t>
+            </w:r>
+          </w:p>
+        </w:tc>
+        <w:tc>
+          <w:tcPr>
+            <w:tcW w:type="dxa" w:w="1973"/>
+            <w:vAlign w:val="center"/>
+            <w:tcBorders>
+              <w:top w:val="single" w:sz="4" w:color="D9D9D9"/>
+              <w:left w:val="single" w:sz="4" w:color="D9D9D9"/>
+              <w:bottom w:val="single" w:sz="4" w:color="D9D9D9"/>
+              <w:right w:val="single" w:sz="4" w:color="D9D9D9"/>
+            </w:tcBorders>
+            <w:tcMar>
+              <w:top w:w="75" w:type="dxa"/>
+              <w:left w:w="75" w:type="dxa"/>
+              <w:bottom w:w="75" w:type="dxa"/>
+              <w:right w:w="75" w:type="dxa"/>
+            </w:tcMar>
+          </w:tcPr>
+          <w:p>
+            <w:pPr>
+              <w:spacing w:after="0"/>
+              <w:jc w:val="center"/>
+            </w:pPr>
+            <w:r>
+              <w:rPr>
+                <w:sz w:val="17"/>
+              </w:rPr>
+            </w:r>
+            <w:r>
+              <w:rPr>
+                <w:sz w:val="17"/>
+              </w:rPr>
+              <w:t>GSE32323 / 配对 17 对</w:t>
+            </w:r>
+          </w:p>
+        </w:tc>
+        <w:tc>
+          <w:tcPr>
+            <w:tcW w:type="dxa" w:w="1973"/>
+            <w:vAlign w:val="center"/>
+            <w:tcBorders>
+              <w:top w:val="single" w:sz="4" w:color="D9D9D9"/>
+              <w:left w:val="single" w:sz="4" w:color="D9D9D9"/>
+              <w:bottom w:val="single" w:sz="4" w:color="D9D9D9"/>
+              <w:right w:val="single" w:sz="4" w:color="D9D9D9"/>
+            </w:tcBorders>
+            <w:tcMar>
+              <w:top w:w="75" w:type="dxa"/>
+              <w:left w:w="75" w:type="dxa"/>
+              <w:bottom w:w="75" w:type="dxa"/>
+              <w:right w:w="75" w:type="dxa"/>
+            </w:tcMar>
+          </w:tcPr>
+          <w:p>
+            <w:pPr>
+              <w:spacing w:after="0"/>
+              <w:jc w:val="center"/>
+            </w:pPr>
+            <w:r>
+              <w:rPr>
+                <w:sz w:val="17"/>
+              </w:rPr>
+            </w:r>
+            <w:r>
+              <w:rPr>
+                <w:sz w:val="17"/>
+              </w:rPr>
+              <w:t>HT29</w:t>
+            </w:r>
+          </w:p>
+        </w:tc>
+        <w:tc>
+          <w:tcPr>
+            <w:tcW w:type="dxa" w:w="1973"/>
+            <w:vAlign w:val="center"/>
+            <w:tcBorders>
+              <w:top w:val="single" w:sz="4" w:color="D9D9D9"/>
+              <w:left w:val="single" w:sz="4" w:color="D9D9D9"/>
+              <w:bottom w:val="single" w:sz="4" w:color="D9D9D9"/>
+              <w:right w:val="single" w:sz="4" w:color="D9D9D9"/>
+            </w:tcBorders>
+            <w:tcMar>
+              <w:top w:w="75" w:type="dxa"/>
+              <w:left w:w="75" w:type="dxa"/>
+              <w:bottom w:w="75" w:type="dxa"/>
+              <w:right w:w="75" w:type="dxa"/>
+            </w:tcMar>
+          </w:tcPr>
+          <w:p>
+            <w:pPr>
+              <w:spacing w:after="0"/>
+              <w:jc w:val="center"/>
+            </w:pPr>
+            <w:r>
+              <w:rPr>
+                <w:sz w:val="17"/>
+              </w:rPr>
+            </w:r>
+            <w:r>
+              <w:rPr>
+                <w:sz w:val="17"/>
+              </w:rPr>
+              <w:t>1189 / 1103</w:t>
+            </w:r>
+          </w:p>
+        </w:tc>
+        <w:tc>
+          <w:tcPr>
+            <w:tcW w:type="dxa" w:w="1973"/>
+            <w:vAlign w:val="center"/>
+            <w:tcBorders>
+              <w:top w:val="single" w:sz="4" w:color="D9D9D9"/>
+              <w:left w:val="single" w:sz="4" w:color="D9D9D9"/>
+              <w:bottom w:val="single" w:sz="4" w:color="D9D9D9"/>
+              <w:right w:val="single" w:sz="4" w:color="D9D9D9"/>
+            </w:tcBorders>
+            <w:tcMar>
+              <w:top w:w="75" w:type="dxa"/>
+              <w:left w:w="75" w:type="dxa"/>
+              <w:bottom w:w="75" w:type="dxa"/>
+              <w:right w:w="75" w:type="dxa"/>
+            </w:tcMar>
+          </w:tcPr>
+          <w:p>
+            <w:pPr>
+              <w:spacing w:after="0"/>
+              <w:jc w:val="center"/>
+            </w:pPr>
+            <w:r>
+              <w:rPr>
+                <w:sz w:val="17"/>
+              </w:rPr>
+            </w:r>
+            <w:r>
+              <w:rPr>
+                <w:sz w:val="17"/>
+              </w:rPr>
+              <w:t>0/11 可测，无法计算</w:t>
+            </w:r>
+          </w:p>
+        </w:tc>
+      </w:tr>
+      <w:tr>
+        <w:tc>
+          <w:tcPr>
+            <w:tcW w:type="dxa" w:w="1973"/>
+            <w:vAlign w:val="center"/>
+            <w:shd w:fill="F2F6F8"/>
+            <w:tcBorders>
+              <w:top w:val="single" w:sz="4" w:color="D9D9D9"/>
+              <w:left w:val="single" w:sz="4" w:color="D9D9D9"/>
+              <w:bottom w:val="single" w:sz="4" w:color="D9D9D9"/>
+              <w:right w:val="single" w:sz="4" w:color="D9D9D9"/>
+            </w:tcBorders>
+            <w:tcMar>
+              <w:top w:w="75" w:type="dxa"/>
+              <w:left w:w="75" w:type="dxa"/>
+              <w:bottom w:w="75" w:type="dxa"/>
+              <w:right w:w="75" w:type="dxa"/>
+            </w:tcMar>
+          </w:tcPr>
+          <w:p>
+            <w:pPr>
+              <w:spacing w:after="0"/>
+            </w:pPr>
+            <w:r>
+              <w:rPr>
+                <w:sz w:val="17"/>
+              </w:rPr>
+            </w:r>
+            <w:r>
+              <w:rPr>
+                <w:sz w:val="17"/>
+              </w:rPr>
+              <w:t>前列腺癌</w:t>
+            </w:r>
+          </w:p>
+        </w:tc>
+        <w:tc>
+          <w:tcPr>
+            <w:tcW w:type="dxa" w:w="1973"/>
+            <w:vAlign w:val="center"/>
+            <w:shd w:fill="F2F6F8"/>
+            <w:tcBorders>
+              <w:top w:val="single" w:sz="4" w:color="D9D9D9"/>
+              <w:left w:val="single" w:sz="4" w:color="D9D9D9"/>
+              <w:bottom w:val="single" w:sz="4" w:color="D9D9D9"/>
+              <w:right w:val="single" w:sz="4" w:color="D9D9D9"/>
+            </w:tcBorders>
+            <w:tcMar>
+              <w:top w:w="75" w:type="dxa"/>
+              <w:left w:w="75" w:type="dxa"/>
+              <w:bottom w:w="75" w:type="dxa"/>
+              <w:right w:w="75" w:type="dxa"/>
+            </w:tcMar>
+          </w:tcPr>
+          <w:p>
+            <w:pPr>
+              <w:spacing w:after="0"/>
+              <w:jc w:val="center"/>
+            </w:pPr>
+            <w:r>
+              <w:rPr>
+                <w:sz w:val="17"/>
+              </w:rPr>
+            </w:r>
+            <w:r>
+              <w:rPr>
+                <w:sz w:val="17"/>
+              </w:rPr>
+              <w:t>GSE46602 / 不配对 36 vs 14</w:t>
+            </w:r>
+          </w:p>
+        </w:tc>
+        <w:tc>
+          <w:tcPr>
+            <w:tcW w:type="dxa" w:w="1973"/>
+            <w:vAlign w:val="center"/>
+            <w:shd w:fill="F2F6F8"/>
+            <w:tcBorders>
+              <w:top w:val="single" w:sz="4" w:color="D9D9D9"/>
+              <w:left w:val="single" w:sz="4" w:color="D9D9D9"/>
+              <w:bottom w:val="single" w:sz="4" w:color="D9D9D9"/>
+              <w:right w:val="single" w:sz="4" w:color="D9D9D9"/>
+            </w:tcBorders>
+            <w:tcMar>
+              <w:top w:w="75" w:type="dxa"/>
+              <w:left w:w="75" w:type="dxa"/>
+              <w:bottom w:w="75" w:type="dxa"/>
+              <w:right w:w="75" w:type="dxa"/>
+            </w:tcMar>
+          </w:tcPr>
+          <w:p>
+            <w:pPr>
+              <w:spacing w:after="0"/>
+              <w:jc w:val="center"/>
+            </w:pPr>
+            <w:r>
+              <w:rPr>
+                <w:sz w:val="17"/>
+              </w:rPr>
+            </w:r>
+            <w:r>
+              <w:rPr>
+                <w:sz w:val="17"/>
+              </w:rPr>
+              <w:t>VCAP</w:t>
+            </w:r>
+          </w:p>
+        </w:tc>
+        <w:tc>
+          <w:tcPr>
+            <w:tcW w:type="dxa" w:w="1973"/>
+            <w:vAlign w:val="center"/>
+            <w:shd w:fill="F2F6F8"/>
+            <w:tcBorders>
+              <w:top w:val="single" w:sz="4" w:color="D9D9D9"/>
+              <w:left w:val="single" w:sz="4" w:color="D9D9D9"/>
+              <w:bottom w:val="single" w:sz="4" w:color="D9D9D9"/>
+              <w:right w:val="single" w:sz="4" w:color="D9D9D9"/>
+            </w:tcBorders>
+            <w:tcMar>
+              <w:top w:w="75" w:type="dxa"/>
+              <w:left w:w="75" w:type="dxa"/>
+              <w:bottom w:w="75" w:type="dxa"/>
+              <w:right w:w="75" w:type="dxa"/>
+            </w:tcMar>
+          </w:tcPr>
+          <w:p>
+            <w:pPr>
+              <w:spacing w:after="0"/>
+              <w:jc w:val="center"/>
+            </w:pPr>
+            <w:r>
+              <w:rPr>
+                <w:sz w:val="17"/>
+              </w:rPr>
+            </w:r>
+            <w:r>
+              <w:rPr>
+                <w:sz w:val="17"/>
+              </w:rPr>
+              <w:t>480 / 837</w:t>
+            </w:r>
+          </w:p>
+        </w:tc>
+        <w:tc>
+          <w:tcPr>
+            <w:tcW w:type="dxa" w:w="1973"/>
+            <w:vAlign w:val="center"/>
+            <w:shd w:fill="F2F6F8"/>
+            <w:tcBorders>
+              <w:top w:val="single" w:sz="4" w:color="D9D9D9"/>
+              <w:left w:val="single" w:sz="4" w:color="D9D9D9"/>
+              <w:bottom w:val="single" w:sz="4" w:color="D9D9D9"/>
+              <w:right w:val="single" w:sz="4" w:color="D9D9D9"/>
+            </w:tcBorders>
+            <w:tcMar>
+              <w:top w:w="75" w:type="dxa"/>
+              <w:left w:w="75" w:type="dxa"/>
+              <w:bottom w:w="75" w:type="dxa"/>
+              <w:right w:w="75" w:type="dxa"/>
+            </w:tcMar>
+          </w:tcPr>
+          <w:p>
+            <w:pPr>
+              <w:spacing w:after="0"/>
+              <w:jc w:val="center"/>
+            </w:pPr>
+            <w:r>
+              <w:rPr>
+                <w:sz w:val="17"/>
+              </w:rPr>
+            </w:r>
+            <w:r>
+              <w:rPr>
+                <w:sz w:val="17"/>
+              </w:rPr>
+              <w:t>8/13 可测，百分位 0.586，p = 0.8</w:t>
+            </w:r>
+          </w:p>
+        </w:tc>
+      </w:tr>
+      <w:tr>
+        <w:tc>
+          <w:tcPr>
+            <w:tcW w:type="dxa" w:w="1973"/>
+            <w:vAlign w:val="center"/>
+            <w:tcBorders>
+              <w:top w:val="single" w:sz="4" w:color="D9D9D9"/>
+              <w:left w:val="single" w:sz="4" w:color="D9D9D9"/>
+              <w:bottom w:val="single" w:sz="4" w:color="D9D9D9"/>
+              <w:right w:val="single" w:sz="4" w:color="D9D9D9"/>
+            </w:tcBorders>
+            <w:tcMar>
+              <w:top w:w="75" w:type="dxa"/>
+              <w:left w:w="75" w:type="dxa"/>
+              <w:bottom w:w="75" w:type="dxa"/>
+              <w:right w:w="75" w:type="dxa"/>
+            </w:tcMar>
+          </w:tcPr>
+          <w:p>
+            <w:pPr>
+              <w:spacing w:after="0"/>
+            </w:pPr>
+            <w:r>
+              <w:rPr>
+                <w:sz w:val="17"/>
+              </w:rPr>
+            </w:r>
+            <w:r>
+              <w:rPr>
+                <w:sz w:val="17"/>
+              </w:rPr>
+              <w:t>黑色素瘤</w:t>
+            </w:r>
+          </w:p>
+        </w:tc>
+        <w:tc>
+          <w:tcPr>
+            <w:tcW w:type="dxa" w:w="1973"/>
+            <w:vAlign w:val="center"/>
+            <w:tcBorders>
+              <w:top w:val="single" w:sz="4" w:color="D9D9D9"/>
+              <w:left w:val="single" w:sz="4" w:color="D9D9D9"/>
+              <w:bottom w:val="single" w:sz="4" w:color="D9D9D9"/>
+              <w:right w:val="single" w:sz="4" w:color="D9D9D9"/>
+            </w:tcBorders>
+            <w:tcMar>
+              <w:top w:w="75" w:type="dxa"/>
+              <w:left w:w="75" w:type="dxa"/>
+              <w:bottom w:w="75" w:type="dxa"/>
+              <w:right w:w="75" w:type="dxa"/>
+            </w:tcMar>
+          </w:tcPr>
+          <w:p>
+            <w:pPr>
+              <w:spacing w:after="0"/>
+              <w:jc w:val="center"/>
+            </w:pPr>
+            <w:r>
+              <w:rPr>
+                <w:sz w:val="17"/>
+              </w:rPr>
+            </w:r>
+            <w:r>
+              <w:rPr>
+                <w:sz w:val="17"/>
+              </w:rPr>
+              <w:t>GSE15605 / 不配对 46 vs 16</w:t>
+            </w:r>
+          </w:p>
+        </w:tc>
+        <w:tc>
+          <w:tcPr>
+            <w:tcW w:type="dxa" w:w="1973"/>
+            <w:vAlign w:val="center"/>
+            <w:tcBorders>
+              <w:top w:val="single" w:sz="4" w:color="D9D9D9"/>
+              <w:left w:val="single" w:sz="4" w:color="D9D9D9"/>
+              <w:bottom w:val="single" w:sz="4" w:color="D9D9D9"/>
+              <w:right w:val="single" w:sz="4" w:color="D9D9D9"/>
+            </w:tcBorders>
+            <w:tcMar>
+              <w:top w:w="75" w:type="dxa"/>
+              <w:left w:w="75" w:type="dxa"/>
+              <w:bottom w:w="75" w:type="dxa"/>
+              <w:right w:w="75" w:type="dxa"/>
+            </w:tcMar>
+          </w:tcPr>
+          <w:p>
+            <w:pPr>
+              <w:spacing w:after="0"/>
+              <w:jc w:val="center"/>
+            </w:pPr>
+            <w:r>
+              <w:rPr>
+                <w:sz w:val="17"/>
+              </w:rPr>
+            </w:r>
+            <w:r>
+              <w:rPr>
+                <w:sz w:val="17"/>
+              </w:rPr>
+              <w:t>A375</w:t>
+            </w:r>
+          </w:p>
+        </w:tc>
+        <w:tc>
+          <w:tcPr>
+            <w:tcW w:type="dxa" w:w="1973"/>
+            <w:vAlign w:val="center"/>
+            <w:tcBorders>
+              <w:top w:val="single" w:sz="4" w:color="D9D9D9"/>
+              <w:left w:val="single" w:sz="4" w:color="D9D9D9"/>
+              <w:bottom w:val="single" w:sz="4" w:color="D9D9D9"/>
+              <w:right w:val="single" w:sz="4" w:color="D9D9D9"/>
+            </w:tcBorders>
+            <w:tcMar>
+              <w:top w:w="75" w:type="dxa"/>
+              <w:left w:w="75" w:type="dxa"/>
+              <w:bottom w:w="75" w:type="dxa"/>
+              <w:right w:w="75" w:type="dxa"/>
+            </w:tcMar>
+          </w:tcPr>
+          <w:p>
+            <w:pPr>
+              <w:spacing w:after="0"/>
+              <w:jc w:val="center"/>
+            </w:pPr>
+            <w:r>
+              <w:rPr>
+                <w:sz w:val="17"/>
+              </w:rPr>
+            </w:r>
+            <w:r>
+              <w:rPr>
+                <w:sz w:val="17"/>
+              </w:rPr>
+              <w:t>1274 / 1677</w:t>
+            </w:r>
+          </w:p>
+        </w:tc>
+        <w:tc>
+          <w:tcPr>
+            <w:tcW w:type="dxa" w:w="1973"/>
+            <w:vAlign w:val="center"/>
+            <w:tcBorders>
+              <w:top w:val="single" w:sz="4" w:color="D9D9D9"/>
+              <w:left w:val="single" w:sz="4" w:color="D9D9D9"/>
+              <w:bottom w:val="single" w:sz="4" w:color="D9D9D9"/>
+              <w:right w:val="single" w:sz="4" w:color="D9D9D9"/>
+            </w:tcBorders>
+            <w:tcMar>
+              <w:top w:w="75" w:type="dxa"/>
+              <w:left w:w="75" w:type="dxa"/>
+              <w:bottom w:w="75" w:type="dxa"/>
+              <w:right w:w="75" w:type="dxa"/>
+            </w:tcMar>
+          </w:tcPr>
+          <w:p>
+            <w:pPr>
+              <w:spacing w:after="0"/>
+              <w:jc w:val="center"/>
+            </w:pPr>
+            <w:r>
+              <w:rPr>
+                <w:sz w:val="17"/>
+              </w:rPr>
+            </w:r>
+            <w:r>
+              <w:rPr>
+                <w:sz w:val="17"/>
+              </w:rPr>
+              <w:t>3/11 可测，百分位 0.318，p = 0.148</w:t>
+            </w:r>
+          </w:p>
+        </w:tc>
+      </w:tr>
+    </w:tbl>
+    <w:p>
+      <w:pPr>
+        <w:spacing w:after="40"/>
+      </w:pPr>
+    </w:p>
+    <w:p>
+      <w:r>
+        <w:t>5 个疾病都从零开始跑通（新疾病现场下载，每个约 10 秒）；肺腺癌签名与冻结结果逐字节一致。参考药恢复只在乳腺癌上显著（p = 0.029），前列腺癌比随机还差，结直肠癌的参考药在 HT29 中都没有签名；黑色素瘤 Top-10 中的 BRAF 抑制剂与 A375 本身携带 BRAF V600E 有关，不能说明反转了疾病签名。这些结果说明流程可以推广到其他疾病，但不说明预测有效。文献审阅改为可配置：肺腺癌沿用冻结审阅的提示词，其他疾病使用中性模板实时运行。DeepSeek 实时审阅的结果为：结直肠癌：完成，15 次调用，42 条引语中 11 条被拒，分级 有冲突 3、证据不足 7；前列腺癌：完成，3 次调用，11 条引语中 0 条被拒，分级 证据不足 10；黑色素瘤：完成，22 次调用，78 条引语中 20 条被拒，分级 有冲突 4、证据不足 3、有希望但不完整 1、有支持 2（两个“有支持”是 dabrafenib 和 vemurafenib，本就是获批的黑色素瘤药，这是文献确认已知药物，不是新发现）；这些分级均未经人工复核。冻结 40 例在新版本上重跑，规则规划器仍为 30/40，DeepSeek 为 38/40（原 36/40，差异属于逐次运行波动）（</w:t>
       </w:r>
       <w:r>
         <w:t>docs/agent_v2.md</w:t>
@@ -2670,7 +3788,7 @@
     </w:p>
     <w:p>
       <w:r>
-        <w:t>本项目的表达反转指标在公开基准上没有取得领先结果，提示基于转录组的单一对抗方向不足以代表药物与疾病的真实治疗关系。LUAD 案例只有单一 A549 细胞系、固定剂量与时间；逐签名 ID 已恢复，但交叉来源的盐型、立体化学和同义词问题仍需实物核验。前十名的类固醇集中也可能反映共同转录反应。候选级文献矩阵已记录支持与反对信号，但它是有边界的人工分诊而非系统综述，且类别证据不能替代候选药特异验证。没有足够证据把任何候选推荐给患者。Agent 只能分析登记过的疾病（目前是肺腺癌和乳腺癌），不能为任意疾病自动挑选 GEO 数据集；乳腺癌没有冻结的文献审阅和候选身份审计，药物端 MCF7 也只代表雌激素受体阳性亚型。</w:t>
+        <w:t>本项目的表达反转指标在公开基准上没有取得领先结果，提示基于转录组的单一对抗方向不足以代表药物与疾病的真实治疗关系。LUAD 案例只有单一 A549 细胞系、固定剂量与时间；逐签名 ID 已恢复，但交叉来源的盐型、立体化学和同义词问题仍需实物核验。前十名的类固醇集中也可能反映共同转录反应。候选级文献矩阵已记录支持与反对信号，但它是有边界的人工分诊而非系统综述，且类别证据不能替代候选药特异验证。没有足够证据把任何候选推荐给患者。Agent 只能分析登记过的 5 个疾病，不能为任意疾病自动挑选 GEO 数据集；可登记的疾病数受药物端细胞系限制。除肺腺癌外，其他疾病都没有冻结的文献审阅和候选身份审计，且各自只用一个细胞系代表疾病（如 MCF7 只代表雌激素受体阳性乳腺癌）。</w:t>
       </w:r>
     </w:p>
     <w:p>

</xml_diff>

<commit_message>
deliverables: rebuild deck v7 and report v5 with fig11 and the updated fig9
Report figure 6 shows the five-disease overview; slide 4 shows the updated
architecture. Word 13 pages, LaTeX 12 pages; 12 slides rendered; checks and
tests pass.

Co-Authored-By: Claude Opus 5.5 <noreply@anthropic.com>
</commit_message>
<xml_diff>
--- a/deliverables/药物重定位Agent_课程设计报告_v5.docx
+++ b/deliverables/药物重定位Agent_课程设计报告_v5.docx
@@ -3768,6 +3768,57 @@
       </w:pPr>
     </w:p>
     <w:p>
+      <w:pPr>
+        <w:jc w:val="center"/>
+      </w:pPr>
+      <w:r>
+        <w:drawing>
+          <wp:inline xmlns:a="http://schemas.openxmlformats.org/drawingml/2006/main" xmlns:pic="http://schemas.openxmlformats.org/drawingml/2006/picture">
+            <wp:extent cx="6035040" cy="2325760"/>
+            <wp:docPr id="6" name="Picture 6"/>
+            <wp:cNvGraphicFramePr>
+              <a:graphicFrameLocks noChangeAspect="1"/>
+            </wp:cNvGraphicFramePr>
+            <a:graphic>
+              <a:graphicData uri="http://schemas.openxmlformats.org/drawingml/2006/picture">
+                <pic:pic>
+                  <pic:nvPicPr>
+                    <pic:cNvPr id="0" name="fig11_registry_overview.png"/>
+                    <pic:cNvPicPr/>
+                  </pic:nvPicPr>
+                  <pic:blipFill>
+                    <a:blip r:embed="rId23"/>
+                    <a:stretch>
+                      <a:fillRect/>
+                    </a:stretch>
+                  </pic:blipFill>
+                  <pic:spPr>
+                    <a:xfrm>
+                      <a:off x="0" y="0"/>
+                      <a:ext cx="6035040" cy="2325760"/>
+                    </a:xfrm>
+                    <a:prstGeom prst="rect"/>
+                  </pic:spPr>
+                </pic:pic>
+              </a:graphicData>
+            </a:graphic>
+          </wp:inline>
+        </w:drawing>
+      </w:r>
+    </w:p>
+    <w:p>
+      <w:pPr>
+        <w:jc w:val="center"/>
+      </w:pPr>
+      <w:r>
+        <w:rPr>
+          <w:color w:val="5A646C"/>
+          <w:sz w:val="17"/>
+        </w:rPr>
+        <w:t>图 6  5 个登记疾病的端到端验证。(a) 从原始 GEO 数据重算的疾病签名（红为上调，蓝为下调）；(b) 预先登记参考药的平均名次百分位（越小越靠前，虚线为随机水平 0.5，绿色为 p &lt; 0.05）。结直肠癌的参考药在 HT29 中均无签名。单次运行，描述性结果。</w:t>
+      </w:r>
+    </w:p>
+    <w:p>
       <w:r>
         <w:t>5 个疾病都从零开始跑通（新疾病现场下载，每个约 10 秒）；肺腺癌签名与冻结结果逐字节一致。参考药恢复只在乳腺癌上显著（p = 0.029），前列腺癌比随机还差，结直肠癌的参考药在 HT29 中都没有签名；黑色素瘤 Top-10 中的 BRAF 抑制剂与 A375 本身携带 BRAF V600E 有关，不能说明反转了疾病签名。这些结果说明流程可以推广到其他疾病，但不说明预测有效。文献审阅改为可配置：肺腺癌沿用冻结审阅的提示词，其他疾病使用中性模板实时运行。DeepSeek 实时审阅的结果为：结直肠癌：完成，15 次调用，42 条引语中 11 条被拒，分级 有冲突 3、证据不足 7；前列腺癌：完成，3 次调用，11 条引语中 0 条被拒，分级 证据不足 10；黑色素瘤：完成，22 次调用，78 条引语中 20 条被拒，分级 有冲突 4、证据不足 3、有希望但不完整 1、有支持 2（两个“有支持”是 dabrafenib 和 vemurafenib，本就是获批的黑色素瘤药，这是文献确认已知药物，不是新发现）；这些分级均未经人工复核。冻结 40 例在新版本上重跑，规则规划器仍为 30/40，DeepSeek 为 38/40（原 36/40，差异属于逐次运行波动）（</w:t>
       </w:r>
@@ -3943,7 +3994,7 @@
       <w:r>
         <w:t>、</w:t>
       </w:r>
-      <w:hyperlink r:id="rId23">
+      <w:hyperlink r:id="rId24">
         <w:r>
           <w:rPr>
             <w:color w:val="174F78"/>
@@ -3954,7 +4005,7 @@
       <w:r>
         <w:t>、</w:t>
       </w:r>
-      <w:hyperlink r:id="rId24">
+      <w:hyperlink r:id="rId25">
         <w:r>
           <w:rPr>
             <w:color w:val="174F78"/>
@@ -3965,7 +4016,7 @@
       <w:r>
         <w:t xml:space="preserve"> 和 </w:t>
       </w:r>
-      <w:hyperlink r:id="rId25">
+      <w:hyperlink r:id="rId26">
         <w:r>
           <w:rPr>
             <w:color w:val="174F78"/>

</xml_diff>